<commit_message>
mab adversary-complaint: typst and docx on the shared cross-engine layout model, Times New Roman 12 pt on both (24 pt double pitch, MLBR Appendix 8(a); 13.8 pt single lines; footnotes 10 pt in 11.5 pt lines; '§§' bound to its number; the court title single-spaced, the allegation number in a half-inch box, the transfer table centered in fixed 1.5 in columns; page numbers from page 2 as reference.xml footer parts with titlePg); docx/reference.xml (base="xengine", {font}) replaces build-reference.sh, render.sh and the EB Garamond reference.docx; docx XENG-001..003 pass (122/122 lines), params.cross_engine: gate; check.sh typst 9 passed 0 failed, docx 13 passed 0 failed (TNR-EMBEDDED, DEF-FONT-002 now pass) (fb-595.68.16)
</commit_message>
<xml_diff>
--- a/courts/first-circuit/massachusetts/federal/bankruptcy-district/adversary-complaint/usage/OUTPUT-adversary-complaint.docx
+++ b/courts/first-circuit/massachusetts/federal/bankruptcy-district/adversary-complaint/usage/OUTPUT-adversary-complaint.docx
@@ -4,7 +4,11 @@
   <w:body>
     <w:p>
       <w:pPr>
-        <w:pStyle w:val="Centered"/>
+        <w:keepNext/>
+        <w:keepLines/>
+        <w:spacing w:before="0" w:after="0" w:line="276" w:lineRule="exact"/>
+        <w:ind w:left="0" w:firstLine="0"/>
+        <w:jc w:val="center"/>
       </w:pPr>
       <w:r>
         <w:rPr>
@@ -16,7 +20,11 @@
     </w:p>
     <w:p>
       <w:pPr>
-        <w:pStyle w:val="Centered"/>
+        <w:keepNext/>
+        <w:keepLines/>
+        <w:spacing w:before="0" w:after="0" w:line="276" w:lineRule="exact"/>
+        <w:ind w:left="0" w:firstLine="0"/>
+        <w:jc w:val="center"/>
       </w:pPr>
       <w:r>
         <w:rPr>
@@ -28,7 +36,11 @@
     </w:p>
     <w:p>
       <w:pPr>
-        <w:pStyle w:val="Centered"/>
+        <w:keepNext/>
+        <w:keepLines/>
+        <w:spacing w:before="0" w:after="0" w:line="276" w:lineRule="exact"/>
+        <w:ind w:left="0" w:firstLine="0"/>
+        <w:jc w:val="center"/>
       </w:pPr>
       <w:r>
         <w:rPr>
@@ -38,29 +50,17 @@
         <w:t xml:space="preserve">EASTERN DIVISION</w:t>
       </w:r>
     </w:p>
-    <w:p>
-      <w:pPr>
-        <w:pStyle w:val="Single"/>
-        <w:spacing w:before="0" w:after="0" w:line="480" w:lineRule="exact"/>
-      </w:pPr>
-    </w:p>
     <w:tbl>
       <w:tblPr>
         <w:tblW w:w="9360" w:type="dxa"/>
         <w:tblLayout w:type="fixed"/>
-        <w:tblBorders>
-          <w:top w:val="nil"/>
-          <w:left w:val="nil"/>
-          <w:bottom w:val="nil"/>
-          <w:right w:val="nil"/>
-          <w:insideH w:val="nil"/>
-          <w:insideV w:val="nil"/>
-        </w:tblBorders>
         <w:tblCellMar>
+          <w:top w:w="0" w:type="dxa"/>
           <w:left w:w="0" w:type="dxa"/>
+          <w:bottom w:w="0" w:type="dxa"/>
           <w:right w:w="0" w:type="dxa"/>
         </w:tblCellMar>
-        <w:tblLook w:val="0000"/>
+        <w:tblLook w:val="0000" w:firstRow="0" w:lastRow="0" w:firstColumn="0" w:lastColumn="0" w:noHBand="0" w:noVBand="0"/>
       </w:tblPr>
       <w:tblGrid>
         <w:gridCol w:w="4896"/>
@@ -68,13 +68,18 @@
         <w:gridCol w:w="4176"/>
       </w:tblGrid>
       <w:tr>
+        <w:trPr>
+          <w:cantSplit/>
+        </w:trPr>
         <w:tc>
           <w:tcPr>
             <w:tcW w:w="4896" w:type="dxa"/>
           </w:tcPr>
           <w:p>
             <w:pPr>
-              <w:pStyle w:val="Single"/>
+              <w:spacing w:before="480" w:after="0" w:line="276" w:lineRule="exact"/>
+              <w:ind w:left="0" w:firstLine="0"/>
+              <w:jc w:val="left"/>
             </w:pPr>
             <w:r>
               <w:t xml:space="preserve">In re:</w:t>
@@ -82,20 +87,49 @@
           </w:p>
           <w:p>
             <w:pPr>
-              <w:pStyle w:val="Single"/>
-            </w:pPr>
-          </w:p>
-          <w:p>
-            <w:pPr>
-              <w:pStyle w:val="Single"/>
-            </w:pPr>
-            <w:r>
-              <w:t xml:space="preserve">THE GOOD GUYS PROVISION CO. INC.,</w:t>
-            </w:r>
-          </w:p>
-          <w:p>
-            <w:pPr>
-              <w:pStyle w:val="Single"/>
+              <w:spacing w:before="276" w:after="0" w:line="276" w:lineRule="exact"/>
+              <w:ind w:left="0" w:firstLine="0"/>
+              <w:jc w:val="left"/>
+            </w:pPr>
+            <w:r>
+              <w:t xml:space="preserve">THE</w:t>
+            </w:r>
+            <w:r>
+              <w:t xml:space="preserve"> </w:t>
+            </w:r>
+            <w:r>
+              <w:t xml:space="preserve">GOOD</w:t>
+            </w:r>
+            <w:r>
+              <w:t xml:space="preserve"> </w:t>
+            </w:r>
+            <w:r>
+              <w:t xml:space="preserve">GUYS</w:t>
+            </w:r>
+            <w:r>
+              <w:t xml:space="preserve"> </w:t>
+            </w:r>
+            <w:r>
+              <w:t xml:space="preserve">PROVISION</w:t>
+            </w:r>
+            <w:r>
+              <w:t xml:space="preserve"> </w:t>
+            </w:r>
+            <w:r>
+              <w:t xml:space="preserve">CO.</w:t>
+            </w:r>
+            <w:r>
+              <w:t xml:space="preserve"> </w:t>
+            </w:r>
+            <w:r>
+              <w:t xml:space="preserve">INC.,</w:t>
+            </w:r>
+          </w:p>
+          <w:p>
+            <w:pPr>
+              <w:spacing w:before="0" w:after="0" w:line="276" w:lineRule="exact"/>
+              <w:ind w:left="0" w:firstLine="0"/>
+              <w:jc w:val="left"/>
             </w:pPr>
             <w:r>
               <w:t xml:space="preserve">Debtors.</w:t>
@@ -108,7 +142,9 @@
           </w:tcPr>
           <w:p>
             <w:pPr>
-              <w:pStyle w:val="Single"/>
+              <w:spacing w:before="480" w:after="0" w:line="276" w:lineRule="exact"/>
+              <w:ind w:left="0" w:firstLine="0"/>
+              <w:jc w:val="left"/>
             </w:pPr>
           </w:p>
         </w:tc>
@@ -118,7 +154,9 @@
           </w:tcPr>
           <w:p>
             <w:pPr>
-              <w:pStyle w:val="Single"/>
+              <w:spacing w:before="480" w:after="0" w:line="276" w:lineRule="exact"/>
+              <w:ind w:left="0" w:firstLine="0"/>
+              <w:jc w:val="left"/>
             </w:pPr>
             <w:r>
               <w:t xml:space="preserve">CHAPTER 7</w:t>
@@ -126,43 +164,33 @@
           </w:p>
           <w:p>
             <w:pPr>
-              <w:pStyle w:val="Single"/>
-            </w:pPr>
-          </w:p>
-          <w:p>
-            <w:pPr>
-              <w:pStyle w:val="Single"/>
-            </w:pPr>
-            <w:r>
-              <w:t xml:space="preserve">CASE NO. 24-12269-CJP</w:t>
+              <w:spacing w:before="276" w:after="0" w:line="276" w:lineRule="exact"/>
+              <w:ind w:left="0" w:firstLine="0"/>
+              <w:jc w:val="left"/>
+            </w:pPr>
+            <w:r>
+              <w:t xml:space="preserve">CASE NO. </w:t>
+            </w:r>
+            <w:r>
+              <w:t xml:space="preserve">24</w:t>
+              <w:noBreakHyphen/>
+              <w:t xml:space="preserve">12269-CJP</w:t>
             </w:r>
           </w:p>
         </w:tc>
       </w:tr>
     </w:tbl>
-    <w:p>
-      <w:pPr>
-        <w:pStyle w:val="Single"/>
-        <w:spacing w:before="0" w:after="0" w:line="480" w:lineRule="exact"/>
-      </w:pPr>
-    </w:p>
     <w:tbl>
       <w:tblPr>
         <w:tblW w:w="9360" w:type="dxa"/>
         <w:tblLayout w:type="fixed"/>
-        <w:tblBorders>
-          <w:top w:val="nil"/>
-          <w:left w:val="nil"/>
-          <w:bottom w:val="nil"/>
-          <w:right w:val="nil"/>
-          <w:insideH w:val="nil"/>
-          <w:insideV w:val="nil"/>
-        </w:tblBorders>
         <w:tblCellMar>
+          <w:top w:w="0" w:type="dxa"/>
           <w:left w:w="0" w:type="dxa"/>
+          <w:bottom w:w="0" w:type="dxa"/>
           <w:right w:w="0" w:type="dxa"/>
         </w:tblCellMar>
-        <w:tblLook w:val="0000"/>
+        <w:tblLook w:val="0000" w:firstRow="0" w:lastRow="0" w:firstColumn="0" w:lastColumn="0" w:noHBand="0" w:noVBand="0"/>
       </w:tblPr>
       <w:tblGrid>
         <w:gridCol w:w="4896"/>
@@ -170,45 +198,140 @@
         <w:gridCol w:w="4176"/>
       </w:tblGrid>
       <w:tr>
+        <w:trPr>
+          <w:cantSplit/>
+        </w:trPr>
         <w:tc>
           <w:tcPr>
             <w:tcW w:w="4896" w:type="dxa"/>
             <w:tcBorders>
+              <w:bottom w:val="single" w:sz="6" w:space="0" w:color="000000"/>
               <w:right w:val="single" w:sz="6" w:space="0" w:color="000000"/>
-              <w:bottom w:val="single" w:sz="6" w:space="0" w:color="000000"/>
             </w:tcBorders>
             <w:tcMar>
+              <w:bottom w:w="160" w:type="dxa"/>
               <w:right w:w="200" w:type="dxa"/>
-              <w:bottom w:w="160" w:type="dxa"/>
             </w:tcMar>
           </w:tcPr>
           <w:p>
             <w:pPr>
-              <w:pStyle w:val="Single"/>
-            </w:pPr>
-            <w:r>
-              <w:t xml:space="preserve">DONALD R. LASSMAN, CHAPTER 7 TRUSTEE</w:t>
-            </w:r>
-          </w:p>
-          <w:p>
-            <w:pPr>
-              <w:pStyle w:val="Single"/>
-            </w:pPr>
-            <w:r>
-              <w:t xml:space="preserve">FOR THE BANKRUPTCY ESTATE OF THE</w:t>
-            </w:r>
-          </w:p>
-          <w:p>
-            <w:pPr>
-              <w:pStyle w:val="Single"/>
-            </w:pPr>
-            <w:r>
-              <w:t xml:space="preserve">GOOD GUYS PROVISION CO. INC.,</w:t>
-            </w:r>
-          </w:p>
-          <w:p>
-            <w:pPr>
-              <w:pStyle w:val="Single"/>
+              <w:spacing w:before="480" w:after="0" w:line="276" w:lineRule="exact"/>
+              <w:ind w:left="0" w:firstLine="0"/>
+              <w:jc w:val="left"/>
+            </w:pPr>
+            <w:r>
+              <w:t xml:space="preserve">DONALD</w:t>
+            </w:r>
+            <w:r>
+              <w:t xml:space="preserve"> </w:t>
+            </w:r>
+            <w:r>
+              <w:t xml:space="preserve">R.</w:t>
+            </w:r>
+            <w:r>
+              <w:t xml:space="preserve"> </w:t>
+            </w:r>
+            <w:r>
+              <w:t xml:space="preserve">LASSMAN,</w:t>
+            </w:r>
+            <w:r>
+              <w:t xml:space="preserve"> </w:t>
+            </w:r>
+            <w:r>
+              <w:t xml:space="preserve">CHAPTER</w:t>
+            </w:r>
+            <w:r>
+              <w:t xml:space="preserve"> </w:t>
+            </w:r>
+            <w:r>
+              <w:t xml:space="preserve">7</w:t>
+            </w:r>
+            <w:r>
+              <w:t xml:space="preserve"> </w:t>
+            </w:r>
+            <w:r>
+              <w:t xml:space="preserve">TRUSTEE</w:t>
+            </w:r>
+          </w:p>
+          <w:p>
+            <w:pPr>
+              <w:spacing w:before="0" w:after="0" w:line="276" w:lineRule="exact"/>
+              <w:ind w:left="0" w:firstLine="0"/>
+              <w:jc w:val="left"/>
+            </w:pPr>
+            <w:r>
+              <w:t xml:space="preserve">FOR</w:t>
+            </w:r>
+            <w:r>
+              <w:t xml:space="preserve"> </w:t>
+            </w:r>
+            <w:r>
+              <w:t xml:space="preserve">THE</w:t>
+            </w:r>
+            <w:r>
+              <w:t xml:space="preserve"> </w:t>
+            </w:r>
+            <w:r>
+              <w:t xml:space="preserve">BANKRUPTCY</w:t>
+            </w:r>
+            <w:r>
+              <w:t xml:space="preserve"> </w:t>
+            </w:r>
+            <w:r>
+              <w:t xml:space="preserve">ESTATE</w:t>
+            </w:r>
+            <w:r>
+              <w:t xml:space="preserve"> </w:t>
+            </w:r>
+            <w:r>
+              <w:t xml:space="preserve">OF</w:t>
+            </w:r>
+            <w:r>
+              <w:t xml:space="preserve"> </w:t>
+            </w:r>
+            <w:r>
+              <w:t xml:space="preserve">THE</w:t>
+            </w:r>
+          </w:p>
+          <w:p>
+            <w:pPr>
+              <w:spacing w:before="0" w:after="0" w:line="276" w:lineRule="exact"/>
+              <w:ind w:left="0" w:firstLine="0"/>
+              <w:jc w:val="left"/>
+            </w:pPr>
+            <w:r>
+              <w:t xml:space="preserve">GOOD</w:t>
+            </w:r>
+            <w:r>
+              <w:t xml:space="preserve"> </w:t>
+            </w:r>
+            <w:r>
+              <w:t xml:space="preserve">GUYS</w:t>
+            </w:r>
+            <w:r>
+              <w:t xml:space="preserve"> </w:t>
+            </w:r>
+            <w:r>
+              <w:t xml:space="preserve">PROVISION</w:t>
+            </w:r>
+            <w:r>
+              <w:t xml:space="preserve"> </w:t>
+            </w:r>
+            <w:r>
+              <w:t xml:space="preserve">CO.</w:t>
+            </w:r>
+            <w:r>
+              <w:t xml:space="preserve"> </w:t>
+            </w:r>
+            <w:r>
+              <w:t xml:space="preserve">INC.,</w:t>
+            </w:r>
+          </w:p>
+          <w:p>
+            <w:pPr>
+              <w:spacing w:before="0" w:after="0" w:line="276" w:lineRule="exact"/>
+              <w:ind w:left="0" w:firstLine="0"/>
+              <w:jc w:val="left"/>
             </w:pPr>
             <w:r>
               <w:t xml:space="preserve">Plaintiff,</w:t>
@@ -216,12 +339,9 @@
           </w:p>
           <w:p>
             <w:pPr>
-              <w:pStyle w:val="Single"/>
-            </w:pPr>
-          </w:p>
-          <w:p>
-            <w:pPr>
-              <w:pStyle w:val="Single"/>
+              <w:spacing w:before="276" w:after="0" w:line="276" w:lineRule="exact"/>
+              <w:ind w:left="0" w:firstLine="0"/>
+              <w:jc w:val="left"/>
             </w:pPr>
             <w:r>
               <w:t xml:space="preserve">v.</w:t>
@@ -229,20 +349,43 @@
           </w:p>
           <w:p>
             <w:pPr>
-              <w:pStyle w:val="Single"/>
-            </w:pPr>
-          </w:p>
-          <w:p>
-            <w:pPr>
-              <w:pStyle w:val="Single"/>
-            </w:pPr>
-            <w:r>
-              <w:t xml:space="preserve">PAUL W. MARKS CO. INC.,</w:t>
-            </w:r>
-          </w:p>
-          <w:p>
-            <w:pPr>
-              <w:pStyle w:val="Single"/>
+              <w:spacing w:before="276" w:after="0" w:line="276" w:lineRule="exact"/>
+              <w:ind w:left="0" w:firstLine="0"/>
+              <w:jc w:val="left"/>
+            </w:pPr>
+            <w:r>
+              <w:t xml:space="preserve">PAUL</w:t>
+            </w:r>
+            <w:r>
+              <w:t xml:space="preserve"> </w:t>
+            </w:r>
+            <w:r>
+              <w:t xml:space="preserve">W.</w:t>
+            </w:r>
+            <w:r>
+              <w:t xml:space="preserve"> </w:t>
+            </w:r>
+            <w:r>
+              <w:t xml:space="preserve">MARKS</w:t>
+            </w:r>
+            <w:r>
+              <w:t xml:space="preserve"> </w:t>
+            </w:r>
+            <w:r>
+              <w:t xml:space="preserve">CO.</w:t>
+            </w:r>
+            <w:r>
+              <w:t xml:space="preserve"> </w:t>
+            </w:r>
+            <w:r>
+              <w:t xml:space="preserve">INC.,</w:t>
+            </w:r>
+          </w:p>
+          <w:p>
+            <w:pPr>
+              <w:spacing w:before="0" w:after="0" w:line="276" w:lineRule="exact"/>
+              <w:ind w:left="0" w:firstLine="0"/>
+              <w:jc w:val="left"/>
             </w:pPr>
             <w:r>
               <w:t xml:space="preserve">Defendant.</w:t>
@@ -255,7 +398,9 @@
           </w:tcPr>
           <w:p>
             <w:pPr>
-              <w:pStyle w:val="Single"/>
+              <w:spacing w:before="480" w:after="0" w:line="276" w:lineRule="exact"/>
+              <w:ind w:left="0" w:firstLine="0"/>
+              <w:jc w:val="left"/>
             </w:pPr>
           </w:p>
         </w:tc>
@@ -265,8 +410,9 @@
           </w:tcPr>
           <w:p>
             <w:pPr>
-              <w:pStyle w:val="Single"/>
+              <w:spacing w:before="480" w:after="0" w:line="276" w:lineRule="exact"/>
               <w:ind w:left="144" w:firstLine="0"/>
+              <w:jc w:val="left"/>
             </w:pPr>
             <w:r>
               <w:t xml:space="preserve">ADV. PROC. NO. ____________</w:t>
@@ -277,28 +423,48 @@
     </w:tbl>
     <w:p>
       <w:pPr>
-        <w:pStyle w:val="Single"/>
-        <w:spacing w:before="0" w:after="0" w:line="480" w:lineRule="exact"/>
-      </w:pPr>
-    </w:p>
-    <w:p>
-      <w:pPr>
-        <w:pStyle w:val="Centered"/>
+        <w:keepNext/>
+        <w:keepLines/>
+        <w:spacing w:before="480" w:after="276" w:line="276" w:lineRule="exact"/>
+        <w:ind w:left="0" w:firstLine="0"/>
+        <w:jc w:val="center"/>
       </w:pPr>
       <w:r>
         <w:rPr>
           <w:b/>
           <w:bCs/>
         </w:rPr>
-        <w:t xml:space="preserve">ADVERSARY COMPLAINT</w:t>
-      </w:r>
-    </w:p>
-    <w:bookmarkStart w:id="20" w:name="parties"/>
+        <w:t xml:space="preserve">ADVERSARY</w:t>
+      </w:r>
+      <w:r>
+        <w:rPr>
+          <w:b/>
+          <w:bCs/>
+        </w:rPr>
+        <w:t xml:space="preserve"> </w:t>
+      </w:r>
+      <w:r>
+        <w:rPr>
+          <w:b/>
+          <w:bCs/>
+        </w:rPr>
+        <w:t xml:space="preserve">COMPLAINT</w:t>
+      </w:r>
+    </w:p>
     <w:p>
       <w:pPr>
         <w:pStyle w:val="Heading1"/>
-      </w:pPr>
-      <w:r>
+        <w:keepNext/>
+        <w:keepLines/>
+        <w:spacing w:before="0" w:after="0" w:line="480" w:lineRule="exact"/>
+        <w:ind w:left="0" w:firstLine="0"/>
+        <w:jc w:val="center"/>
+      </w:pPr>
+      <w:r>
+        <w:rPr>
+          <w:b/>
+          <w:bCs/>
+        </w:rPr>
         <w:t xml:space="preserve">PARTIES</w:t>
       </w:r>
     </w:p>
@@ -307,7 +473,13 @@
         <w:pStyle w:val="NumberedParagraph"/>
       </w:pPr>
       <w:r>
-        <w:t xml:space="preserve">Donald R. Lassman (the “Trustee”) is the Chapter 7 Trustee of the bankruptcy estate of The Good Guys Provision Co. Inc. (the “Debtor”), and maintains the right to bring and prosecute all actions against the Defendant pursuant to §§ 547 and 550 of the United States Bankruptcy Code.</w:t>
+        <w:t xml:space="preserve">1.</w:t>
+      </w:r>
+      <w:r>
+        <w:tab/>
+      </w:r>
+      <w:r>
+        <w:t xml:space="preserve">Donald R. Lassman (the “Trustee”) is the Chapter 7 Trustee of the bankruptcy estate of The Good Guys Provision Co. Inc. (the “Debtor”), and maintains the right to bring and prosecute all actions against the Defendant pursuant to §§ 547 and 550 of the United States Bankruptcy Code.</w:t>
       </w:r>
     </w:p>
     <w:p>
@@ -315,17 +487,58 @@
         <w:pStyle w:val="NumberedParagraph"/>
       </w:pPr>
       <w:r>
-        <w:t xml:space="preserve">The Defendant, Paul W. Marks Co. Inc. (the “Defendant”), upon information and belief is a Massachusetts corporation with its principal place of business located at 8 Commercial Street, Everett, Massachusetts 02149.</w:t>
-      </w:r>
-    </w:p>
-    <w:bookmarkEnd w:id="20"/>
-    <w:bookmarkStart w:id="21" w:name="jurisdiction-and-venue"/>
+        <w:t xml:space="preserve">2.</w:t>
+      </w:r>
+      <w:r>
+        <w:tab/>
+      </w:r>
+      <w:r>
+        <w:t xml:space="preserve">The Defendant, Paul W. Marks Co. Inc. (the “Defendant”), upon information and belief is a Massachusetts corporation with its principal place of business located at 8 Commercial Street, Everett, Massachusetts 02149.</w:t>
+      </w:r>
+    </w:p>
     <w:p>
       <w:pPr>
         <w:pStyle w:val="Heading1"/>
-      </w:pPr>
-      <w:r>
-        <w:t xml:space="preserve">JURISDICTION AND VENUE</w:t>
+        <w:keepNext/>
+        <w:keepLines/>
+        <w:spacing w:before="0" w:after="0" w:line="480" w:lineRule="exact"/>
+        <w:ind w:left="0" w:firstLine="0"/>
+        <w:jc w:val="center"/>
+      </w:pPr>
+      <w:r>
+        <w:rPr>
+          <w:b/>
+          <w:bCs/>
+        </w:rPr>
+        <w:t xml:space="preserve">JURISDICTION</w:t>
+      </w:r>
+      <w:r>
+        <w:rPr>
+          <w:b/>
+          <w:bCs/>
+        </w:rPr>
+        <w:t xml:space="preserve"> </w:t>
+      </w:r>
+      <w:r>
+        <w:rPr>
+          <w:b/>
+          <w:bCs/>
+        </w:rPr>
+        <w:t xml:space="preserve">AND</w:t>
+      </w:r>
+      <w:r>
+        <w:rPr>
+          <w:b/>
+          <w:bCs/>
+        </w:rPr>
+        <w:t xml:space="preserve"> </w:t>
+      </w:r>
+      <w:r>
+        <w:rPr>
+          <w:b/>
+          <w:bCs/>
+        </w:rPr>
+        <w:t xml:space="preserve">VENUE</w:t>
       </w:r>
     </w:p>
     <w:p>
@@ -333,7 +546,19 @@
         <w:pStyle w:val="NumberedParagraph"/>
       </w:pPr>
       <w:r>
-        <w:t xml:space="preserve">The Trustee brings this adversary proceeding pursuant to §§ 547 and 550 of the Bankruptcy Code, 11 U.S.C. §§ 101-1330, and Rule 7001 of the Federal Rules of Bankruptcy Procedure.</w:t>
+        <w:t xml:space="preserve">3.</w:t>
+      </w:r>
+      <w:r>
+        <w:tab/>
+      </w:r>
+      <w:r>
+        <w:t xml:space="preserve">The Trustee brings this adversary proceeding pursuant to §§ 547 and 550 of the Bankruptcy Code, 11 U.S.C. §§ 101</w:t>
+      </w:r>
+      <w:r>
+        <w:noBreakHyphen/>
+      </w:r>
+      <w:r>
+        <w:t xml:space="preserve">1330, and Rule 7001 of the Federal Rules of Bankruptcy Procedure.</w:t>
       </w:r>
     </w:p>
     <w:p>
@@ -341,7 +566,13 @@
         <w:pStyle w:val="NumberedParagraph"/>
       </w:pPr>
       <w:r>
-        <w:t xml:space="preserve">This Court has jurisdiction over this adversary proceeding pursuant to 28 U.S.C. §§ 157(a), 157(b)(1) and 1334(b). This adversary proceeding is a core proceeding pursuant to 28 U.S.C. § 157(b)(2)(F).</w:t>
+        <w:t xml:space="preserve">4.</w:t>
+      </w:r>
+      <w:r>
+        <w:tab/>
+      </w:r>
+      <w:r>
+        <w:t xml:space="preserve">This Court has jurisdiction over this adversary proceeding pursuant to 28 U.S.C. §§ 157(a), 157(b)⁠(1) and 1334(b). This adversary proceeding is a core proceeding pursuant to 28 U.S.C. § 157(b)⁠(2)⁠(F).</w:t>
       </w:r>
     </w:p>
     <w:p>
@@ -349,6 +580,12 @@
         <w:pStyle w:val="NumberedParagraph"/>
       </w:pPr>
       <w:r>
+        <w:t xml:space="preserve">5.</w:t>
+      </w:r>
+      <w:r>
+        <w:tab/>
+      </w:r>
+      <w:r>
         <w:t xml:space="preserve">The Trustee does not consent to the entry of final orders or judgment by the bankruptcy court.</w:t>
       </w:r>
     </w:p>
@@ -357,17 +594,44 @@
         <w:pStyle w:val="NumberedParagraph"/>
       </w:pPr>
       <w:r>
-        <w:t xml:space="preserve">Venue is this District is proper pursuant to 28 U.S.C. § 1409(a) because this proceeding arises under Title 11.</w:t>
-      </w:r>
-    </w:p>
-    <w:bookmarkEnd w:id="21"/>
-    <w:bookmarkStart w:id="22" w:name="general-allegations"/>
+        <w:t xml:space="preserve">6.</w:t>
+      </w:r>
+      <w:r>
+        <w:tab/>
+      </w:r>
+      <w:r>
+        <w:t xml:space="preserve">Venue is this District is proper pursuant to 28 U.S.C. § 1409(a) because this proceeding arises under Title 11.</w:t>
+      </w:r>
+    </w:p>
     <w:p>
       <w:pPr>
         <w:pStyle w:val="Heading1"/>
-      </w:pPr>
-      <w:r>
-        <w:t xml:space="preserve">GENERAL ALLEGATIONS</w:t>
+        <w:keepNext/>
+        <w:keepLines/>
+        <w:spacing w:before="0" w:after="0" w:line="480" w:lineRule="exact"/>
+        <w:ind w:left="0" w:firstLine="0"/>
+        <w:jc w:val="center"/>
+      </w:pPr>
+      <w:r>
+        <w:rPr>
+          <w:b/>
+          <w:bCs/>
+        </w:rPr>
+        <w:t xml:space="preserve">GENERAL</w:t>
+      </w:r>
+      <w:r>
+        <w:rPr>
+          <w:b/>
+          <w:bCs/>
+        </w:rPr>
+        <w:t xml:space="preserve"> </w:t>
+      </w:r>
+      <w:r>
+        <w:rPr>
+          <w:b/>
+          <w:bCs/>
+        </w:rPr>
+        <w:t xml:space="preserve">ALLEGATIONS</w:t>
       </w:r>
     </w:p>
     <w:p>
@@ -375,6 +639,12 @@
         <w:pStyle w:val="NumberedParagraph"/>
       </w:pPr>
       <w:r>
+        <w:t xml:space="preserve">7.</w:t>
+      </w:r>
+      <w:r>
+        <w:tab/>
+      </w:r>
+      <w:r>
         <w:t xml:space="preserve">On November 14, 2024 (the “Petition Date”), an involuntary petition pursuant to Chapter 7 of the Bankruptcy Code was filed against the Debtor.</w:t>
       </w:r>
     </w:p>
@@ -383,6 +653,12 @@
         <w:pStyle w:val="NumberedParagraph"/>
       </w:pPr>
       <w:r>
+        <w:t xml:space="preserve">8.</w:t>
+      </w:r>
+      <w:r>
+        <w:tab/>
+      </w:r>
+      <w:r>
         <w:t xml:space="preserve">On February 28, 2025, the United States Bankruptcy Court for the District of Massachusetts entered an Order for Relief.</w:t>
       </w:r>
     </w:p>
@@ -391,6 +667,12 @@
         <w:pStyle w:val="NumberedParagraph"/>
       </w:pPr>
       <w:r>
+        <w:t xml:space="preserve">9.</w:t>
+      </w:r>
+      <w:r>
+        <w:tab/>
+      </w:r>
+      <w:r>
         <w:t xml:space="preserve">On February 28, 2025, the Trustee was appointed as the Chapter 7 Trustee of the bankruptcy estate of the Debtor.</w:t>
       </w:r>
     </w:p>
@@ -398,52 +680,107 @@
       <w:pPr>
         <w:pStyle w:val="NumberedParagraph"/>
       </w:pPr>
+      <w:r>
+        <w:t xml:space="preserve">10.</w:t>
+      </w:r>
+      <w:r>
+        <w:tab/>
+      </w:r>
       <w:r>
         <w:t xml:space="preserve">The Debtor’s financial records indicate that within ninety (90) days before the Petition Date (the “Preference Period”), the Debtor made the following payments to the Defendant totaling $109,602.63 (the “Preference Payments”):</w:t>
       </w:r>
     </w:p>
     <w:tbl>
       <w:tblPr>
-        <w:tblStyle w:val="Table"/>
-        <w:tblW w:type="auto" w:w="0"/>
-        <w:tblLook w:firstRow="1" w:lastRow="0" w:firstColumn="0" w:lastColumn="0" w:noHBand="0" w:noVBand="0" w:val="0020"/>
+        <w:tblW w:w="6480" w:type="dxa"/>
+        <w:jc w:val="center"/>
+        <w:tblLayout w:type="fixed"/>
+        <w:tblCellMar>
+          <w:top w:w="0" w:type="dxa"/>
+          <w:left w:w="0" w:type="dxa"/>
+          <w:bottom w:w="0" w:type="dxa"/>
+          <w:right w:w="0" w:type="dxa"/>
+        </w:tblCellMar>
+        <w:tblLook w:val="0000" w:firstRow="0" w:lastRow="0" w:firstColumn="0" w:lastColumn="0" w:noHBand="0" w:noVBand="0"/>
       </w:tblPr>
       <w:tblGrid>
-        <w:gridCol w:w="2640"/>
-        <w:gridCol w:w="2640"/>
-        <w:gridCol w:w="2640"/>
+        <w:gridCol w:w="2160"/>
+        <w:gridCol w:w="2160"/>
+        <w:gridCol w:w="2160"/>
       </w:tblGrid>
       <w:tr>
         <w:trPr>
-          <w:tblHeader w:val="on"/>
+          <w:cantSplit/>
         </w:trPr>
         <w:tc>
-          <w:tcPr/>
-          <w:p>
-            <w:pPr>
-              <w:pStyle w:val="Compact"/>
-            </w:pPr>
-            <w:r>
-              <w:t xml:space="preserve">Transfer Date</w:t>
-            </w:r>
-          </w:p>
-        </w:tc>
-        <w:tc>
-          <w:tcPr/>
-          <w:p>
-            <w:pPr>
-              <w:pStyle w:val="Compact"/>
-            </w:pPr>
-            <w:r>
-              <w:t xml:space="preserve">Check No./Wire</w:t>
-            </w:r>
-          </w:p>
-        </w:tc>
-        <w:tc>
-          <w:tcPr/>
-          <w:p>
-            <w:pPr>
-              <w:pStyle w:val="Compact"/>
+          <w:tcPr>
+            <w:tcW w:w="2160" w:type="dxa"/>
+            <w:tcMar>
+              <w:top w:w="40" w:type="dxa"/>
+              <w:left w:w="160" w:type="dxa"/>
+              <w:bottom w:w="40" w:type="dxa"/>
+              <w:right w:w="160" w:type="dxa"/>
+            </w:tcMar>
+          </w:tcPr>
+          <w:p>
+            <w:pPr>
+              <w:keepNext/>
+              <w:spacing w:before="276" w:after="0" w:line="276" w:lineRule="exact"/>
+              <w:ind w:left="0" w:firstLine="0"/>
+              <w:jc w:val="left"/>
+            </w:pPr>
+            <w:r>
+              <w:t xml:space="preserve">Transfer</w:t>
+            </w:r>
+            <w:r>
+              <w:t xml:space="preserve"> </w:t>
+            </w:r>
+            <w:r>
+              <w:t xml:space="preserve">Date</w:t>
+            </w:r>
+          </w:p>
+        </w:tc>
+        <w:tc>
+          <w:tcPr>
+            <w:tcW w:w="2160" w:type="dxa"/>
+            <w:tcMar>
+              <w:top w:w="40" w:type="dxa"/>
+              <w:left w:w="160" w:type="dxa"/>
+              <w:bottom w:w="40" w:type="dxa"/>
+              <w:right w:w="160" w:type="dxa"/>
+            </w:tcMar>
+          </w:tcPr>
+          <w:p>
+            <w:pPr>
+              <w:spacing w:before="276" w:after="0" w:line="276" w:lineRule="exact"/>
+              <w:ind w:left="0" w:firstLine="0"/>
+              <w:jc w:val="left"/>
+            </w:pPr>
+            <w:r>
+              <w:t xml:space="preserve">Check</w:t>
+            </w:r>
+            <w:r>
+              <w:t xml:space="preserve"> </w:t>
+            </w:r>
+            <w:r>
+              <w:t xml:space="preserve">No./​Wire</w:t>
+            </w:r>
+          </w:p>
+        </w:tc>
+        <w:tc>
+          <w:tcPr>
+            <w:tcW w:w="2160" w:type="dxa"/>
+            <w:tcMar>
+              <w:top w:w="40" w:type="dxa"/>
+              <w:left w:w="160" w:type="dxa"/>
+              <w:bottom w:w="40" w:type="dxa"/>
+              <w:right w:w="160" w:type="dxa"/>
+            </w:tcMar>
+          </w:tcPr>
+          <w:p>
+            <w:pPr>
+              <w:spacing w:before="276" w:after="0" w:line="276" w:lineRule="exact"/>
+              <w:ind w:left="0" w:firstLine="0"/>
               <w:jc w:val="right"/>
             </w:pPr>
             <w:r>
@@ -453,11 +790,25 @@
         </w:tc>
       </w:tr>
       <w:tr>
-        <w:tc>
-          <w:tcPr/>
-          <w:p>
-            <w:pPr>
-              <w:pStyle w:val="Compact"/>
+        <w:trPr>
+          <w:cantSplit/>
+        </w:trPr>
+        <w:tc>
+          <w:tcPr>
+            <w:tcW w:w="2160" w:type="dxa"/>
+            <w:tcMar>
+              <w:top w:w="40" w:type="dxa"/>
+              <w:left w:w="160" w:type="dxa"/>
+              <w:bottom w:w="40" w:type="dxa"/>
+              <w:right w:w="160" w:type="dxa"/>
+            </w:tcMar>
+          </w:tcPr>
+          <w:p>
+            <w:pPr>
+              <w:keepNext/>
+              <w:spacing w:before="0" w:after="0" w:line="276" w:lineRule="exact"/>
+              <w:ind w:left="0" w:firstLine="0"/>
+              <w:jc w:val="left"/>
             </w:pPr>
             <w:r>
               <w:t xml:space="preserve">8/22/2024</w:t>
@@ -465,10 +816,20 @@
           </w:p>
         </w:tc>
         <w:tc>
-          <w:tcPr/>
-          <w:p>
-            <w:pPr>
-              <w:pStyle w:val="Compact"/>
+          <w:tcPr>
+            <w:tcW w:w="2160" w:type="dxa"/>
+            <w:tcMar>
+              <w:top w:w="40" w:type="dxa"/>
+              <w:left w:w="160" w:type="dxa"/>
+              <w:bottom w:w="40" w:type="dxa"/>
+              <w:right w:w="160" w:type="dxa"/>
+            </w:tcMar>
+          </w:tcPr>
+          <w:p>
+            <w:pPr>
+              <w:spacing w:before="0" w:after="0" w:line="276" w:lineRule="exact"/>
+              <w:ind w:left="0" w:firstLine="0"/>
+              <w:jc w:val="left"/>
             </w:pPr>
             <w:r>
               <w:t xml:space="preserve">12206</w:t>
@@ -476,10 +837,19 @@
           </w:p>
         </w:tc>
         <w:tc>
-          <w:tcPr/>
-          <w:p>
-            <w:pPr>
-              <w:pStyle w:val="Compact"/>
+          <w:tcPr>
+            <w:tcW w:w="2160" w:type="dxa"/>
+            <w:tcMar>
+              <w:top w:w="40" w:type="dxa"/>
+              <w:left w:w="160" w:type="dxa"/>
+              <w:bottom w:w="40" w:type="dxa"/>
+              <w:right w:w="160" w:type="dxa"/>
+            </w:tcMar>
+          </w:tcPr>
+          <w:p>
+            <w:pPr>
+              <w:spacing w:before="0" w:after="0" w:line="276" w:lineRule="exact"/>
+              <w:ind w:left="0" w:firstLine="0"/>
               <w:jc w:val="right"/>
             </w:pPr>
             <w:r>
@@ -489,11 +859,25 @@
         </w:tc>
       </w:tr>
       <w:tr>
-        <w:tc>
-          <w:tcPr/>
-          <w:p>
-            <w:pPr>
-              <w:pStyle w:val="Compact"/>
+        <w:trPr>
+          <w:cantSplit/>
+        </w:trPr>
+        <w:tc>
+          <w:tcPr>
+            <w:tcW w:w="2160" w:type="dxa"/>
+            <w:tcMar>
+              <w:top w:w="40" w:type="dxa"/>
+              <w:left w:w="160" w:type="dxa"/>
+              <w:bottom w:w="40" w:type="dxa"/>
+              <w:right w:w="160" w:type="dxa"/>
+            </w:tcMar>
+          </w:tcPr>
+          <w:p>
+            <w:pPr>
+              <w:keepNext/>
+              <w:spacing w:before="0" w:after="0" w:line="276" w:lineRule="exact"/>
+              <w:ind w:left="0" w:firstLine="0"/>
+              <w:jc w:val="left"/>
             </w:pPr>
             <w:r>
               <w:t xml:space="preserve">8/22/2024</w:t>
@@ -501,10 +885,20 @@
           </w:p>
         </w:tc>
         <w:tc>
-          <w:tcPr/>
-          <w:p>
-            <w:pPr>
-              <w:pStyle w:val="Compact"/>
+          <w:tcPr>
+            <w:tcW w:w="2160" w:type="dxa"/>
+            <w:tcMar>
+              <w:top w:w="40" w:type="dxa"/>
+              <w:left w:w="160" w:type="dxa"/>
+              <w:bottom w:w="40" w:type="dxa"/>
+              <w:right w:w="160" w:type="dxa"/>
+            </w:tcMar>
+          </w:tcPr>
+          <w:p>
+            <w:pPr>
+              <w:spacing w:before="0" w:after="0" w:line="276" w:lineRule="exact"/>
+              <w:ind w:left="0" w:firstLine="0"/>
+              <w:jc w:val="left"/>
             </w:pPr>
             <w:r>
               <w:t xml:space="preserve">12215</w:t>
@@ -512,10 +906,19 @@
           </w:p>
         </w:tc>
         <w:tc>
-          <w:tcPr/>
-          <w:p>
-            <w:pPr>
-              <w:pStyle w:val="Compact"/>
+          <w:tcPr>
+            <w:tcW w:w="2160" w:type="dxa"/>
+            <w:tcMar>
+              <w:top w:w="40" w:type="dxa"/>
+              <w:left w:w="160" w:type="dxa"/>
+              <w:bottom w:w="40" w:type="dxa"/>
+              <w:right w:w="160" w:type="dxa"/>
+            </w:tcMar>
+          </w:tcPr>
+          <w:p>
+            <w:pPr>
+              <w:spacing w:before="0" w:after="0" w:line="276" w:lineRule="exact"/>
+              <w:ind w:left="0" w:firstLine="0"/>
               <w:jc w:val="right"/>
             </w:pPr>
             <w:r>
@@ -525,11 +928,25 @@
         </w:tc>
       </w:tr>
       <w:tr>
-        <w:tc>
-          <w:tcPr/>
-          <w:p>
-            <w:pPr>
-              <w:pStyle w:val="Compact"/>
+        <w:trPr>
+          <w:cantSplit/>
+        </w:trPr>
+        <w:tc>
+          <w:tcPr>
+            <w:tcW w:w="2160" w:type="dxa"/>
+            <w:tcMar>
+              <w:top w:w="40" w:type="dxa"/>
+              <w:left w:w="160" w:type="dxa"/>
+              <w:bottom w:w="40" w:type="dxa"/>
+              <w:right w:w="160" w:type="dxa"/>
+            </w:tcMar>
+          </w:tcPr>
+          <w:p>
+            <w:pPr>
+              <w:keepNext/>
+              <w:spacing w:before="0" w:after="0" w:line="276" w:lineRule="exact"/>
+              <w:ind w:left="0" w:firstLine="0"/>
+              <w:jc w:val="left"/>
             </w:pPr>
             <w:r>
               <w:t xml:space="preserve">9/26/2024</w:t>
@@ -537,10 +954,20 @@
           </w:p>
         </w:tc>
         <w:tc>
-          <w:tcPr/>
-          <w:p>
-            <w:pPr>
-              <w:pStyle w:val="Compact"/>
+          <w:tcPr>
+            <w:tcW w:w="2160" w:type="dxa"/>
+            <w:tcMar>
+              <w:top w:w="40" w:type="dxa"/>
+              <w:left w:w="160" w:type="dxa"/>
+              <w:bottom w:w="40" w:type="dxa"/>
+              <w:right w:w="160" w:type="dxa"/>
+            </w:tcMar>
+          </w:tcPr>
+          <w:p>
+            <w:pPr>
+              <w:spacing w:before="0" w:after="0" w:line="276" w:lineRule="exact"/>
+              <w:ind w:left="0" w:firstLine="0"/>
+              <w:jc w:val="left"/>
             </w:pPr>
             <w:r>
               <w:t xml:space="preserve">12243</w:t>
@@ -548,10 +975,19 @@
           </w:p>
         </w:tc>
         <w:tc>
-          <w:tcPr/>
-          <w:p>
-            <w:pPr>
-              <w:pStyle w:val="Compact"/>
+          <w:tcPr>
+            <w:tcW w:w="2160" w:type="dxa"/>
+            <w:tcMar>
+              <w:top w:w="40" w:type="dxa"/>
+              <w:left w:w="160" w:type="dxa"/>
+              <w:bottom w:w="40" w:type="dxa"/>
+              <w:right w:w="160" w:type="dxa"/>
+            </w:tcMar>
+          </w:tcPr>
+          <w:p>
+            <w:pPr>
+              <w:spacing w:before="0" w:after="0" w:line="276" w:lineRule="exact"/>
+              <w:ind w:left="0" w:firstLine="0"/>
               <w:jc w:val="right"/>
             </w:pPr>
             <w:r>
@@ -561,11 +997,25 @@
         </w:tc>
       </w:tr>
       <w:tr>
-        <w:tc>
-          <w:tcPr/>
-          <w:p>
-            <w:pPr>
-              <w:pStyle w:val="Compact"/>
+        <w:trPr>
+          <w:cantSplit/>
+        </w:trPr>
+        <w:tc>
+          <w:tcPr>
+            <w:tcW w:w="2160" w:type="dxa"/>
+            <w:tcMar>
+              <w:top w:w="40" w:type="dxa"/>
+              <w:left w:w="160" w:type="dxa"/>
+              <w:bottom w:w="40" w:type="dxa"/>
+              <w:right w:w="160" w:type="dxa"/>
+            </w:tcMar>
+          </w:tcPr>
+          <w:p>
+            <w:pPr>
+              <w:keepNext/>
+              <w:spacing w:before="0" w:after="0" w:line="276" w:lineRule="exact"/>
+              <w:ind w:left="0" w:firstLine="0"/>
+              <w:jc w:val="left"/>
             </w:pPr>
             <w:r>
               <w:t xml:space="preserve">9/26/2024</w:t>
@@ -573,10 +1023,20 @@
           </w:p>
         </w:tc>
         <w:tc>
-          <w:tcPr/>
-          <w:p>
-            <w:pPr>
-              <w:pStyle w:val="Compact"/>
+          <w:tcPr>
+            <w:tcW w:w="2160" w:type="dxa"/>
+            <w:tcMar>
+              <w:top w:w="40" w:type="dxa"/>
+              <w:left w:w="160" w:type="dxa"/>
+              <w:bottom w:w="40" w:type="dxa"/>
+              <w:right w:w="160" w:type="dxa"/>
+            </w:tcMar>
+          </w:tcPr>
+          <w:p>
+            <w:pPr>
+              <w:spacing w:before="0" w:after="0" w:line="276" w:lineRule="exact"/>
+              <w:ind w:left="0" w:firstLine="0"/>
+              <w:jc w:val="left"/>
             </w:pPr>
             <w:r>
               <w:t xml:space="preserve">12256</w:t>
@@ -584,10 +1044,19 @@
           </w:p>
         </w:tc>
         <w:tc>
-          <w:tcPr/>
-          <w:p>
-            <w:pPr>
-              <w:pStyle w:val="Compact"/>
+          <w:tcPr>
+            <w:tcW w:w="2160" w:type="dxa"/>
+            <w:tcMar>
+              <w:top w:w="40" w:type="dxa"/>
+              <w:left w:w="160" w:type="dxa"/>
+              <w:bottom w:w="40" w:type="dxa"/>
+              <w:right w:w="160" w:type="dxa"/>
+            </w:tcMar>
+          </w:tcPr>
+          <w:p>
+            <w:pPr>
+              <w:spacing w:before="0" w:after="0" w:line="276" w:lineRule="exact"/>
+              <w:ind w:left="0" w:firstLine="0"/>
               <w:jc w:val="right"/>
             </w:pPr>
             <w:r>
@@ -597,11 +1066,25 @@
         </w:tc>
       </w:tr>
       <w:tr>
-        <w:tc>
-          <w:tcPr/>
-          <w:p>
-            <w:pPr>
-              <w:pStyle w:val="Compact"/>
+        <w:trPr>
+          <w:cantSplit/>
+        </w:trPr>
+        <w:tc>
+          <w:tcPr>
+            <w:tcW w:w="2160" w:type="dxa"/>
+            <w:tcMar>
+              <w:top w:w="40" w:type="dxa"/>
+              <w:left w:w="160" w:type="dxa"/>
+              <w:bottom w:w="40" w:type="dxa"/>
+              <w:right w:w="160" w:type="dxa"/>
+            </w:tcMar>
+          </w:tcPr>
+          <w:p>
+            <w:pPr>
+              <w:keepNext/>
+              <w:spacing w:before="0" w:after="0" w:line="276" w:lineRule="exact"/>
+              <w:ind w:left="0" w:firstLine="0"/>
+              <w:jc w:val="left"/>
             </w:pPr>
             <w:r>
               <w:t xml:space="preserve">9/26/2024</w:t>
@@ -609,10 +1092,20 @@
           </w:p>
         </w:tc>
         <w:tc>
-          <w:tcPr/>
-          <w:p>
-            <w:pPr>
-              <w:pStyle w:val="Compact"/>
+          <w:tcPr>
+            <w:tcW w:w="2160" w:type="dxa"/>
+            <w:tcMar>
+              <w:top w:w="40" w:type="dxa"/>
+              <w:left w:w="160" w:type="dxa"/>
+              <w:bottom w:w="40" w:type="dxa"/>
+              <w:right w:w="160" w:type="dxa"/>
+            </w:tcMar>
+          </w:tcPr>
+          <w:p>
+            <w:pPr>
+              <w:spacing w:before="0" w:after="0" w:line="276" w:lineRule="exact"/>
+              <w:ind w:left="0" w:firstLine="0"/>
+              <w:jc w:val="left"/>
             </w:pPr>
             <w:r>
               <w:t xml:space="preserve">12265</w:t>
@@ -620,10 +1113,19 @@
           </w:p>
         </w:tc>
         <w:tc>
-          <w:tcPr/>
-          <w:p>
-            <w:pPr>
-              <w:pStyle w:val="Compact"/>
+          <w:tcPr>
+            <w:tcW w:w="2160" w:type="dxa"/>
+            <w:tcMar>
+              <w:top w:w="40" w:type="dxa"/>
+              <w:left w:w="160" w:type="dxa"/>
+              <w:bottom w:w="40" w:type="dxa"/>
+              <w:right w:w="160" w:type="dxa"/>
+            </w:tcMar>
+          </w:tcPr>
+          <w:p>
+            <w:pPr>
+              <w:spacing w:before="0" w:after="0" w:line="276" w:lineRule="exact"/>
+              <w:ind w:left="0" w:firstLine="0"/>
               <w:jc w:val="right"/>
             </w:pPr>
             <w:r>
@@ -633,11 +1135,25 @@
         </w:tc>
       </w:tr>
       <w:tr>
-        <w:tc>
-          <w:tcPr/>
-          <w:p>
-            <w:pPr>
-              <w:pStyle w:val="Compact"/>
+        <w:trPr>
+          <w:cantSplit/>
+        </w:trPr>
+        <w:tc>
+          <w:tcPr>
+            <w:tcW w:w="2160" w:type="dxa"/>
+            <w:tcMar>
+              <w:top w:w="40" w:type="dxa"/>
+              <w:left w:w="160" w:type="dxa"/>
+              <w:bottom w:w="40" w:type="dxa"/>
+              <w:right w:w="160" w:type="dxa"/>
+            </w:tcMar>
+          </w:tcPr>
+          <w:p>
+            <w:pPr>
+              <w:keepNext/>
+              <w:spacing w:before="0" w:after="0" w:line="276" w:lineRule="exact"/>
+              <w:ind w:left="0" w:firstLine="0"/>
+              <w:jc w:val="left"/>
             </w:pPr>
             <w:r>
               <w:t xml:space="preserve">9/26/2024</w:t>
@@ -645,10 +1161,20 @@
           </w:p>
         </w:tc>
         <w:tc>
-          <w:tcPr/>
-          <w:p>
-            <w:pPr>
-              <w:pStyle w:val="Compact"/>
+          <w:tcPr>
+            <w:tcW w:w="2160" w:type="dxa"/>
+            <w:tcMar>
+              <w:top w:w="40" w:type="dxa"/>
+              <w:left w:w="160" w:type="dxa"/>
+              <w:bottom w:w="40" w:type="dxa"/>
+              <w:right w:w="160" w:type="dxa"/>
+            </w:tcMar>
+          </w:tcPr>
+          <w:p>
+            <w:pPr>
+              <w:spacing w:before="0" w:after="0" w:line="276" w:lineRule="exact"/>
+              <w:ind w:left="0" w:firstLine="0"/>
+              <w:jc w:val="left"/>
             </w:pPr>
             <w:r>
               <w:t xml:space="preserve">12275</w:t>
@@ -656,10 +1182,19 @@
           </w:p>
         </w:tc>
         <w:tc>
-          <w:tcPr/>
-          <w:p>
-            <w:pPr>
-              <w:pStyle w:val="Compact"/>
+          <w:tcPr>
+            <w:tcW w:w="2160" w:type="dxa"/>
+            <w:tcMar>
+              <w:top w:w="40" w:type="dxa"/>
+              <w:left w:w="160" w:type="dxa"/>
+              <w:bottom w:w="40" w:type="dxa"/>
+              <w:right w:w="160" w:type="dxa"/>
+            </w:tcMar>
+          </w:tcPr>
+          <w:p>
+            <w:pPr>
+              <w:spacing w:before="0" w:after="0" w:line="276" w:lineRule="exact"/>
+              <w:ind w:left="0" w:firstLine="0"/>
               <w:jc w:val="right"/>
             </w:pPr>
             <w:r>
@@ -669,11 +1204,25 @@
         </w:tc>
       </w:tr>
       <w:tr>
-        <w:tc>
-          <w:tcPr/>
-          <w:p>
-            <w:pPr>
-              <w:pStyle w:val="Compact"/>
+        <w:trPr>
+          <w:cantSplit/>
+        </w:trPr>
+        <w:tc>
+          <w:tcPr>
+            <w:tcW w:w="2160" w:type="dxa"/>
+            <w:tcMar>
+              <w:top w:w="40" w:type="dxa"/>
+              <w:left w:w="160" w:type="dxa"/>
+              <w:bottom w:w="40" w:type="dxa"/>
+              <w:right w:w="160" w:type="dxa"/>
+            </w:tcMar>
+          </w:tcPr>
+          <w:p>
+            <w:pPr>
+              <w:keepNext/>
+              <w:spacing w:before="0" w:after="0" w:line="276" w:lineRule="exact"/>
+              <w:ind w:left="0" w:firstLine="0"/>
+              <w:jc w:val="left"/>
             </w:pPr>
             <w:r>
               <w:t xml:space="preserve">10/30/2024</w:t>
@@ -681,10 +1230,20 @@
           </w:p>
         </w:tc>
         <w:tc>
-          <w:tcPr/>
-          <w:p>
-            <w:pPr>
-              <w:pStyle w:val="Compact"/>
+          <w:tcPr>
+            <w:tcW w:w="2160" w:type="dxa"/>
+            <w:tcMar>
+              <w:top w:w="40" w:type="dxa"/>
+              <w:left w:w="160" w:type="dxa"/>
+              <w:bottom w:w="40" w:type="dxa"/>
+              <w:right w:w="160" w:type="dxa"/>
+            </w:tcMar>
+          </w:tcPr>
+          <w:p>
+            <w:pPr>
+              <w:spacing w:before="0" w:after="0" w:line="276" w:lineRule="exact"/>
+              <w:ind w:left="0" w:firstLine="0"/>
+              <w:jc w:val="left"/>
             </w:pPr>
             <w:r>
               <w:t xml:space="preserve">12286</w:t>
@@ -692,10 +1251,19 @@
           </w:p>
         </w:tc>
         <w:tc>
-          <w:tcPr/>
-          <w:p>
-            <w:pPr>
-              <w:pStyle w:val="Compact"/>
+          <w:tcPr>
+            <w:tcW w:w="2160" w:type="dxa"/>
+            <w:tcMar>
+              <w:top w:w="40" w:type="dxa"/>
+              <w:left w:w="160" w:type="dxa"/>
+              <w:bottom w:w="40" w:type="dxa"/>
+              <w:right w:w="160" w:type="dxa"/>
+            </w:tcMar>
+          </w:tcPr>
+          <w:p>
+            <w:pPr>
+              <w:spacing w:before="0" w:after="0" w:line="276" w:lineRule="exact"/>
+              <w:ind w:left="0" w:firstLine="0"/>
               <w:jc w:val="right"/>
             </w:pPr>
             <w:r>
@@ -705,11 +1273,25 @@
         </w:tc>
       </w:tr>
       <w:tr>
-        <w:tc>
-          <w:tcPr/>
-          <w:p>
-            <w:pPr>
-              <w:pStyle w:val="Compact"/>
+        <w:trPr>
+          <w:cantSplit/>
+        </w:trPr>
+        <w:tc>
+          <w:tcPr>
+            <w:tcW w:w="2160" w:type="dxa"/>
+            <w:tcMar>
+              <w:top w:w="40" w:type="dxa"/>
+              <w:left w:w="160" w:type="dxa"/>
+              <w:bottom w:w="40" w:type="dxa"/>
+              <w:right w:w="160" w:type="dxa"/>
+            </w:tcMar>
+          </w:tcPr>
+          <w:p>
+            <w:pPr>
+              <w:keepNext/>
+              <w:spacing w:before="0" w:after="0" w:line="276" w:lineRule="exact"/>
+              <w:ind w:left="0" w:firstLine="0"/>
+              <w:jc w:val="left"/>
             </w:pPr>
             <w:r>
               <w:t xml:space="preserve">10/30/2024</w:t>
@@ -717,10 +1299,20 @@
           </w:p>
         </w:tc>
         <w:tc>
-          <w:tcPr/>
-          <w:p>
-            <w:pPr>
-              <w:pStyle w:val="Compact"/>
+          <w:tcPr>
+            <w:tcW w:w="2160" w:type="dxa"/>
+            <w:tcMar>
+              <w:top w:w="40" w:type="dxa"/>
+              <w:left w:w="160" w:type="dxa"/>
+              <w:bottom w:w="40" w:type="dxa"/>
+              <w:right w:w="160" w:type="dxa"/>
+            </w:tcMar>
+          </w:tcPr>
+          <w:p>
+            <w:pPr>
+              <w:spacing w:before="0" w:after="0" w:line="276" w:lineRule="exact"/>
+              <w:ind w:left="0" w:firstLine="0"/>
+              <w:jc w:val="left"/>
             </w:pPr>
             <w:r>
               <w:t xml:space="preserve">12294</w:t>
@@ -728,10 +1320,19 @@
           </w:p>
         </w:tc>
         <w:tc>
-          <w:tcPr/>
-          <w:p>
-            <w:pPr>
-              <w:pStyle w:val="Compact"/>
+          <w:tcPr>
+            <w:tcW w:w="2160" w:type="dxa"/>
+            <w:tcMar>
+              <w:top w:w="40" w:type="dxa"/>
+              <w:left w:w="160" w:type="dxa"/>
+              <w:bottom w:w="40" w:type="dxa"/>
+              <w:right w:w="160" w:type="dxa"/>
+            </w:tcMar>
+          </w:tcPr>
+          <w:p>
+            <w:pPr>
+              <w:spacing w:before="0" w:after="0" w:line="276" w:lineRule="exact"/>
+              <w:ind w:left="0" w:firstLine="0"/>
               <w:jc w:val="right"/>
             </w:pPr>
             <w:r>
@@ -741,11 +1342,25 @@
         </w:tc>
       </w:tr>
       <w:tr>
-        <w:tc>
-          <w:tcPr/>
-          <w:p>
-            <w:pPr>
-              <w:pStyle w:val="Compact"/>
+        <w:trPr>
+          <w:cantSplit/>
+        </w:trPr>
+        <w:tc>
+          <w:tcPr>
+            <w:tcW w:w="2160" w:type="dxa"/>
+            <w:tcMar>
+              <w:top w:w="40" w:type="dxa"/>
+              <w:left w:w="160" w:type="dxa"/>
+              <w:bottom w:w="40" w:type="dxa"/>
+              <w:right w:w="160" w:type="dxa"/>
+            </w:tcMar>
+          </w:tcPr>
+          <w:p>
+            <w:pPr>
+              <w:keepNext/>
+              <w:spacing w:before="0" w:after="0" w:line="276" w:lineRule="exact"/>
+              <w:ind w:left="0" w:firstLine="0"/>
+              <w:jc w:val="left"/>
             </w:pPr>
             <w:r>
               <w:t xml:space="preserve">10/30/2024</w:t>
@@ -753,10 +1368,20 @@
           </w:p>
         </w:tc>
         <w:tc>
-          <w:tcPr/>
-          <w:p>
-            <w:pPr>
-              <w:pStyle w:val="Compact"/>
+          <w:tcPr>
+            <w:tcW w:w="2160" w:type="dxa"/>
+            <w:tcMar>
+              <w:top w:w="40" w:type="dxa"/>
+              <w:left w:w="160" w:type="dxa"/>
+              <w:bottom w:w="40" w:type="dxa"/>
+              <w:right w:w="160" w:type="dxa"/>
+            </w:tcMar>
+          </w:tcPr>
+          <w:p>
+            <w:pPr>
+              <w:spacing w:before="0" w:after="0" w:line="276" w:lineRule="exact"/>
+              <w:ind w:left="0" w:firstLine="0"/>
+              <w:jc w:val="left"/>
             </w:pPr>
             <w:r>
               <w:t xml:space="preserve">12307</w:t>
@@ -764,10 +1389,19 @@
           </w:p>
         </w:tc>
         <w:tc>
-          <w:tcPr/>
-          <w:p>
-            <w:pPr>
-              <w:pStyle w:val="Compact"/>
+          <w:tcPr>
+            <w:tcW w:w="2160" w:type="dxa"/>
+            <w:tcMar>
+              <w:top w:w="40" w:type="dxa"/>
+              <w:left w:w="160" w:type="dxa"/>
+              <w:bottom w:w="40" w:type="dxa"/>
+              <w:right w:w="160" w:type="dxa"/>
+            </w:tcMar>
+          </w:tcPr>
+          <w:p>
+            <w:pPr>
+              <w:spacing w:before="0" w:after="0" w:line="276" w:lineRule="exact"/>
+              <w:ind w:left="0" w:firstLine="0"/>
               <w:jc w:val="right"/>
             </w:pPr>
             <w:r>
@@ -777,19 +1411,42 @@
         </w:tc>
       </w:tr>
       <w:tr>
-        <w:tc>
-          <w:tcPr/>
-          <w:p>
-            <w:pPr>
-              <w:pStyle w:val="Compact"/>
-            </w:pPr>
-          </w:p>
-        </w:tc>
-        <w:tc>
-          <w:tcPr/>
-          <w:p>
-            <w:pPr>
-              <w:pStyle w:val="Compact"/>
+        <w:trPr>
+          <w:cantSplit/>
+        </w:trPr>
+        <w:tc>
+          <w:tcPr>
+            <w:tcW w:w="2160" w:type="dxa"/>
+            <w:tcMar>
+              <w:top w:w="40" w:type="dxa"/>
+              <w:left w:w="160" w:type="dxa"/>
+              <w:bottom w:w="40" w:type="dxa"/>
+              <w:right w:w="160" w:type="dxa"/>
+            </w:tcMar>
+          </w:tcPr>
+          <w:p>
+            <w:pPr>
+              <w:spacing w:before="0" w:after="276" w:line="276" w:lineRule="exact"/>
+              <w:ind w:left="0" w:firstLine="0"/>
+              <w:jc w:val="left"/>
+            </w:pPr>
+          </w:p>
+        </w:tc>
+        <w:tc>
+          <w:tcPr>
+            <w:tcW w:w="2160" w:type="dxa"/>
+            <w:tcMar>
+              <w:top w:w="40" w:type="dxa"/>
+              <w:left w:w="160" w:type="dxa"/>
+              <w:bottom w:w="40" w:type="dxa"/>
+              <w:right w:w="160" w:type="dxa"/>
+            </w:tcMar>
+          </w:tcPr>
+          <w:p>
+            <w:pPr>
+              <w:spacing w:before="0" w:after="276" w:line="276" w:lineRule="exact"/>
+              <w:ind w:left="0" w:firstLine="0"/>
+              <w:jc w:val="left"/>
             </w:pPr>
             <w:r>
               <w:t xml:space="preserve">TOTAL</w:t>
@@ -797,10 +1454,19 @@
           </w:p>
         </w:tc>
         <w:tc>
-          <w:tcPr/>
-          <w:p>
-            <w:pPr>
-              <w:pStyle w:val="Compact"/>
+          <w:tcPr>
+            <w:tcW w:w="2160" w:type="dxa"/>
+            <w:tcMar>
+              <w:top w:w="40" w:type="dxa"/>
+              <w:left w:w="160" w:type="dxa"/>
+              <w:bottom w:w="40" w:type="dxa"/>
+              <w:right w:w="160" w:type="dxa"/>
+            </w:tcMar>
+          </w:tcPr>
+          <w:p>
+            <w:pPr>
+              <w:spacing w:before="0" w:after="276" w:line="276" w:lineRule="exact"/>
+              <w:ind w:left="0" w:firstLine="0"/>
               <w:jc w:val="right"/>
             </w:pPr>
             <w:r>
@@ -815,6 +1481,12 @@
         <w:pStyle w:val="NumberedParagraph"/>
       </w:pPr>
       <w:r>
+        <w:t xml:space="preserve">11.</w:t>
+      </w:r>
+      <w:r>
+        <w:tab/>
+      </w:r>
+      <w:r>
         <w:t xml:space="preserve">On October 14, 2025, the Trustee sent a demand (the “Demand Letter”) to the Defendant requesting the Preference Payments either be returned, or in the alternative, that the Defendant advise the Trustee of any defenses it claimed.</w:t>
       </w:r>
     </w:p>
@@ -823,6 +1495,12 @@
         <w:pStyle w:val="NumberedParagraph"/>
       </w:pPr>
       <w:r>
+        <w:t xml:space="preserve">12.</w:t>
+      </w:r>
+      <w:r>
+        <w:tab/>
+      </w:r>
+      <w:r>
         <w:t xml:space="preserve">The Defendant failed to respond to the Demand Letter.</w:t>
       </w:r>
     </w:p>
@@ -831,6 +1509,12 @@
         <w:pStyle w:val="NumberedParagraph"/>
       </w:pPr>
       <w:r>
+        <w:t xml:space="preserve">13.</w:t>
+      </w:r>
+      <w:r>
+        <w:tab/>
+      </w:r>
+      <w:r>
         <w:t xml:space="preserve">The Trustee conducted a new value analysis based on the proof of claim filed against the Debtor’s estate and the new value provided by the Defendant to the Debtor reduces the Trustee’s claim to $27,608.17.</w:t>
       </w:r>
     </w:p>
@@ -839,26 +1523,145 @@
         <w:pStyle w:val="NumberedParagraph"/>
       </w:pPr>
       <w:r>
+        <w:t xml:space="preserve">14.</w:t>
+      </w:r>
+      <w:r>
+        <w:tab/>
+      </w:r>
+      <w:r>
         <w:t xml:space="preserve">Based on the Trustee’s review of proofs of claim filed against the Debtor’s estate, the Debtor’s books and records, and other documents and information available to the Trustee and his accountants, the Trustee believes that the Defendant has only a partial defense to recovery. Specifically, the Trustee believes that any new value provided by the Defendant to the Debtor only limits the Defendant’s exposure and does not provide a total defense to the avoidance and recovery of the Preference Payments.</w:t>
       </w:r>
     </w:p>
-    <w:bookmarkEnd w:id="22"/>
-    <w:bookmarkStart w:id="24" w:name="count-i"/>
     <w:p>
       <w:pPr>
         <w:pStyle w:val="Heading1"/>
-      </w:pPr>
-      <w:r>
-        <w:t xml:space="preserve">COUNT I</w:t>
-      </w:r>
-    </w:p>
-    <w:bookmarkStart w:id="23" w:name="Xccf8afc7900305ceb60bf69da70e0f49fad2181"/>
+        <w:keepNext/>
+        <w:keepLines/>
+        <w:spacing w:before="0" w:after="0" w:line="480" w:lineRule="exact"/>
+        <w:ind w:left="0" w:firstLine="0"/>
+        <w:jc w:val="center"/>
+      </w:pPr>
+      <w:r>
+        <w:rPr>
+          <w:b/>
+          <w:bCs/>
+        </w:rPr>
+        <w:t xml:space="preserve">COUNT</w:t>
+      </w:r>
+      <w:r>
+        <w:rPr>
+          <w:b/>
+          <w:bCs/>
+        </w:rPr>
+        <w:t xml:space="preserve"> </w:t>
+      </w:r>
+      <w:r>
+        <w:rPr>
+          <w:b/>
+          <w:bCs/>
+        </w:rPr>
+        <w:t xml:space="preserve">I</w:t>
+      </w:r>
+    </w:p>
     <w:p>
       <w:pPr>
         <w:pStyle w:val="Heading2"/>
-      </w:pPr>
-      <w:r>
-        <w:t xml:space="preserve">(Avoidance and Recovery of the Preference Payments)</w:t>
+        <w:keepNext/>
+        <w:keepLines/>
+        <w:spacing w:before="0" w:after="0" w:line="480" w:lineRule="exact"/>
+        <w:ind w:left="0" w:firstLine="0"/>
+        <w:jc w:val="center"/>
+      </w:pPr>
+      <w:r>
+        <w:rPr>
+          <w:b/>
+          <w:bCs/>
+        </w:rPr>
+        <w:t xml:space="preserve">(Avoidance</w:t>
+      </w:r>
+      <w:r>
+        <w:rPr>
+          <w:b/>
+          <w:bCs/>
+        </w:rPr>
+        <w:t xml:space="preserve"> </w:t>
+      </w:r>
+      <w:r>
+        <w:rPr>
+          <w:b/>
+          <w:bCs/>
+        </w:rPr>
+        <w:t xml:space="preserve">and</w:t>
+      </w:r>
+      <w:r>
+        <w:rPr>
+          <w:b/>
+          <w:bCs/>
+        </w:rPr>
+        <w:t xml:space="preserve"> </w:t>
+      </w:r>
+      <w:r>
+        <w:rPr>
+          <w:b/>
+          <w:bCs/>
+        </w:rPr>
+        <w:t xml:space="preserve">Recovery</w:t>
+      </w:r>
+      <w:r>
+        <w:rPr>
+          <w:b/>
+          <w:bCs/>
+        </w:rPr>
+        <w:t xml:space="preserve"> </w:t>
+      </w:r>
+      <w:r>
+        <w:rPr>
+          <w:b/>
+          <w:bCs/>
+        </w:rPr>
+        <w:t xml:space="preserve">of</w:t>
+      </w:r>
+      <w:r>
+        <w:rPr>
+          <w:b/>
+          <w:bCs/>
+        </w:rPr>
+        <w:t xml:space="preserve"> </w:t>
+      </w:r>
+      <w:r>
+        <w:rPr>
+          <w:b/>
+          <w:bCs/>
+        </w:rPr>
+        <w:t xml:space="preserve">the</w:t>
+      </w:r>
+      <w:r>
+        <w:rPr>
+          <w:b/>
+          <w:bCs/>
+        </w:rPr>
+        <w:t xml:space="preserve"> </w:t>
+      </w:r>
+      <w:r>
+        <w:rPr>
+          <w:b/>
+          <w:bCs/>
+        </w:rPr>
+        <w:t xml:space="preserve">Preference</w:t>
+      </w:r>
+      <w:r>
+        <w:rPr>
+          <w:b/>
+          <w:bCs/>
+        </w:rPr>
+        <w:t xml:space="preserve"> </w:t>
+      </w:r>
+      <w:r>
+        <w:rPr>
+          <w:b/>
+          <w:bCs/>
+        </w:rPr>
+        <w:t xml:space="preserve">Payments)</w:t>
       </w:r>
     </w:p>
     <w:p>
@@ -866,6 +1669,12 @@
         <w:pStyle w:val="NumberedParagraph"/>
       </w:pPr>
       <w:r>
+        <w:t xml:space="preserve">15.</w:t>
+      </w:r>
+      <w:r>
+        <w:tab/>
+      </w:r>
+      <w:r>
         <w:t xml:space="preserve">The Trustee incorporates by reference each and every allegation set forth above as if fully recited herein.</w:t>
       </w:r>
     </w:p>
@@ -874,6 +1683,12 @@
         <w:pStyle w:val="NumberedParagraph"/>
       </w:pPr>
       <w:r>
+        <w:t xml:space="preserve">16.</w:t>
+      </w:r>
+      <w:r>
+        <w:tab/>
+      </w:r>
+      <w:r>
         <w:t xml:space="preserve">The Trustee has conducted reasonable due diligence concerning the avoidance and recovery of the Preference Payments from the Defendant.</w:t>
       </w:r>
     </w:p>
@@ -882,6 +1697,12 @@
         <w:pStyle w:val="NumberedParagraph"/>
       </w:pPr>
       <w:r>
+        <w:t xml:space="preserve">17.</w:t>
+      </w:r>
+      <w:r>
+        <w:tab/>
+      </w:r>
+      <w:r>
         <w:t xml:space="preserve">The Preference Payments constitute a transfer of an interest of the Debtor in property.</w:t>
       </w:r>
     </w:p>
@@ -890,6 +1711,12 @@
         <w:pStyle w:val="NumberedParagraph"/>
       </w:pPr>
       <w:r>
+        <w:t xml:space="preserve">18.</w:t>
+      </w:r>
+      <w:r>
+        <w:tab/>
+      </w:r>
+      <w:r>
         <w:t xml:space="preserve">The Preference Payments were made to or for the benefit of the Defendant.</w:t>
       </w:r>
     </w:p>
@@ -898,6 +1725,12 @@
         <w:pStyle w:val="NumberedParagraph"/>
       </w:pPr>
       <w:r>
+        <w:t xml:space="preserve">19.</w:t>
+      </w:r>
+      <w:r>
+        <w:tab/>
+      </w:r>
+      <w:r>
         <w:t xml:space="preserve">The Preference Payments were made for or on account of an antecedent debt owed by the Debtor to the Defendant before such payment was made.</w:t>
       </w:r>
     </w:p>
@@ -906,6 +1739,12 @@
         <w:pStyle w:val="NumberedParagraph"/>
       </w:pPr>
       <w:r>
+        <w:t xml:space="preserve">20.</w:t>
+      </w:r>
+      <w:r>
+        <w:tab/>
+      </w:r>
+      <w:r>
         <w:t xml:space="preserve">The Preference Payments were made within ninety (90) days before the Petition Date.</w:t>
       </w:r>
     </w:p>
@@ -914,6 +1753,12 @@
         <w:pStyle w:val="NumberedParagraph"/>
       </w:pPr>
       <w:r>
+        <w:t xml:space="preserve">21.</w:t>
+      </w:r>
+      <w:r>
+        <w:tab/>
+      </w:r>
+      <w:r>
         <w:t xml:space="preserve">The Preference Payments were made while the Debtor was insolvent.</w:t>
       </w:r>
     </w:p>
@@ -922,6 +1767,12 @@
         <w:pStyle w:val="NumberedParagraph"/>
       </w:pPr>
       <w:r>
+        <w:t xml:space="preserve">22.</w:t>
+      </w:r>
+      <w:r>
+        <w:tab/>
+      </w:r>
+      <w:r>
         <w:t xml:space="preserve">The Preference Payments enabled the Defendant to receive more than it would have received in a case under Chapter 7 of the Bankruptcy Code if the Preference Payments had not been made, and the Defendant received payment of such debt to the extent provided by the provisions of the Bankruptcy Code.</w:t>
       </w:r>
     </w:p>
@@ -930,6 +1781,12 @@
         <w:pStyle w:val="NumberedParagraph"/>
       </w:pPr>
       <w:r>
+        <w:t xml:space="preserve">23.</w:t>
+      </w:r>
+      <w:r>
+        <w:tab/>
+      </w:r>
+      <w:r>
         <w:t xml:space="preserve">The Defendant was the initial transferee of the Preference Payments and the entity for whose benefit the Preference Payments were made.</w:t>
       </w:r>
     </w:p>
@@ -938,7 +1795,13 @@
         <w:pStyle w:val="NumberedParagraph"/>
       </w:pPr>
       <w:r>
-        <w:t xml:space="preserve">The Preference Payments constitute a preferential transfer of property within the meaning of 11 U.S.C. § 547(b).</w:t>
+        <w:t xml:space="preserve">24.</w:t>
+      </w:r>
+      <w:r>
+        <w:tab/>
+      </w:r>
+      <w:r>
+        <w:t xml:space="preserve">The Preference Payments constitute a preferential transfer of property within the meaning of 11 U.S.C. § 547(b).</w:t>
       </w:r>
     </w:p>
     <w:p>
@@ -951,210 +1814,489 @@
     </w:p>
     <w:p>
       <w:pPr>
-        <w:pStyle w:val="Compact"/>
-        <w:numPr>
-          <w:ilvl w:val="0"/>
-          <w:numId w:val="1001"/>
-        </w:numPr>
-      </w:pPr>
-      <w:r>
-        <w:t xml:space="preserve">Avoiding the Preference Payments as a preferential transfer under § 547(b) of the Bankruptcy Code;</w:t>
-      </w:r>
-    </w:p>
-    <w:p>
-      <w:pPr>
-        <w:pStyle w:val="Compact"/>
-        <w:numPr>
-          <w:ilvl w:val="0"/>
-          <w:numId w:val="1001"/>
-        </w:numPr>
-      </w:pPr>
-      <w:r>
-        <w:t xml:space="preserve">Awarding the Trustee judgment against the Defendant, under § 550 of the Bankruptcy Code, in the amount of $27,608.17, plus statutory interest thereon;</w:t>
-      </w:r>
-    </w:p>
-    <w:p>
-      <w:pPr>
-        <w:pStyle w:val="Compact"/>
-        <w:numPr>
-          <w:ilvl w:val="0"/>
-          <w:numId w:val="1001"/>
-        </w:numPr>
-      </w:pPr>
+        <w:pStyle w:val="LetteredItem"/>
+      </w:pPr>
+      <w:r>
+        <w:t xml:space="preserve">a.</w:t>
+      </w:r>
+      <w:r>
+        <w:tab/>
+      </w:r>
+      <w:r>
+        <w:t xml:space="preserve">Avoiding the Preference Payments as a preferential transfer under § 547(b) of the Bankruptcy Code;</w:t>
+      </w:r>
+    </w:p>
+    <w:p>
+      <w:pPr>
+        <w:pStyle w:val="LetteredItem"/>
+      </w:pPr>
+      <w:r>
+        <w:t xml:space="preserve">b.</w:t>
+      </w:r>
+      <w:r>
+        <w:tab/>
+      </w:r>
+      <w:r>
+        <w:t xml:space="preserve">Awarding the Trustee judgment against the Defendant, under § 550 of the Bankruptcy Code, in the amount of $27,608.17, plus statutory interest thereon;</w:t>
+      </w:r>
+    </w:p>
+    <w:p>
+      <w:pPr>
+        <w:pStyle w:val="LetteredItem"/>
+      </w:pPr>
+      <w:r>
+        <w:t xml:space="preserve">c.</w:t>
+      </w:r>
+      <w:r>
+        <w:tab/>
+      </w:r>
       <w:r>
         <w:t xml:space="preserve">Awarding the Trustee his costs and expenses incurred in prosecuting this adversary proceeding, including without limitation, reasonable attorneys’ fees and costs; and</w:t>
       </w:r>
     </w:p>
     <w:p>
       <w:pPr>
-        <w:pStyle w:val="Compact"/>
-        <w:numPr>
-          <w:ilvl w:val="0"/>
-          <w:numId w:val="1001"/>
-        </w:numPr>
-      </w:pPr>
+        <w:pStyle w:val="LetteredItem"/>
+      </w:pPr>
+      <w:r>
+        <w:t xml:space="preserve">d.</w:t>
+      </w:r>
+      <w:r>
+        <w:tab/>
+      </w:r>
       <w:r>
         <w:t xml:space="preserve">Granting the Trustee such other and further relief as the Court deems just and proper.</w:t>
       </w:r>
     </w:p>
     <w:p>
       <w:pPr>
-        <w:pStyle w:val="Single"/>
         <w:keepNext/>
-        <w:spacing w:before="0" w:after="0" w:line="480" w:lineRule="exact"/>
-      </w:pPr>
-    </w:p>
-    <w:p>
-      <w:pPr>
-        <w:pStyle w:val="Signature"/>
+        <w:keepLines/>
+        <w:spacing w:before="480" w:after="0" w:line="276" w:lineRule="exact"/>
+        <w:ind w:left="4464" w:firstLine="0"/>
+        <w:jc w:val="left"/>
+      </w:pPr>
+      <w:r>
+        <w:t xml:space="preserve">Respectfully</w:t>
+      </w:r>
+      <w:r>
+        <w:t xml:space="preserve"> </w:t>
+      </w:r>
+      <w:r>
+        <w:t xml:space="preserve">Submitted,</w:t>
+      </w:r>
+    </w:p>
+    <w:p>
+      <w:pPr>
         <w:keepNext/>
-      </w:pPr>
-      <w:r>
-        <w:t xml:space="preserve">Respectfully Submitted,</w:t>
-      </w:r>
-    </w:p>
-    <w:p>
-      <w:pPr>
-        <w:pStyle w:val="Single"/>
+        <w:keepLines/>
+        <w:spacing w:before="138" w:after="0" w:line="276" w:lineRule="exact"/>
+        <w:ind w:left="4464" w:firstLine="0"/>
+        <w:jc w:val="left"/>
+      </w:pPr>
+      <w:r>
+        <w:t xml:space="preserve">DONALD</w:t>
+      </w:r>
+      <w:r>
+        <w:t xml:space="preserve"> </w:t>
+      </w:r>
+      <w:r>
+        <w:t xml:space="preserve">R.</w:t>
+      </w:r>
+      <w:r>
+        <w:t xml:space="preserve"> </w:t>
+      </w:r>
+      <w:r>
+        <w:t xml:space="preserve">LASSMAN,</w:t>
+      </w:r>
+      <w:r>
+        <w:t xml:space="preserve"> </w:t>
+      </w:r>
+      <w:r>
+        <w:t xml:space="preserve">CHAPTER</w:t>
+      </w:r>
+      <w:r>
+        <w:t xml:space="preserve"> </w:t>
+      </w:r>
+      <w:r>
+        <w:t xml:space="preserve">7</w:t>
+      </w:r>
+      <w:r>
+        <w:t xml:space="preserve"> </w:t>
+      </w:r>
+      <w:r>
+        <w:t xml:space="preserve">TRUSTEE</w:t>
+      </w:r>
+    </w:p>
+    <w:p>
+      <w:pPr>
         <w:keepNext/>
-        <w:spacing w:before="0" w:after="0" w:line="180" w:lineRule="exact"/>
-      </w:pPr>
-    </w:p>
-    <w:p>
-      <w:pPr>
-        <w:pStyle w:val="Signature"/>
+        <w:keepLines/>
+        <w:spacing w:before="0" w:after="0" w:line="276" w:lineRule="exact"/>
+        <w:ind w:left="4464" w:firstLine="0"/>
+        <w:jc w:val="left"/>
+      </w:pPr>
+      <w:r>
+        <w:t xml:space="preserve">OF</w:t>
+      </w:r>
+      <w:r>
+        <w:t xml:space="preserve"> </w:t>
+      </w:r>
+      <w:r>
+        <w:t xml:space="preserve">THE</w:t>
+      </w:r>
+      <w:r>
+        <w:t xml:space="preserve"> </w:t>
+      </w:r>
+      <w:r>
+        <w:t xml:space="preserve">BANKRUPTCY</w:t>
+      </w:r>
+      <w:r>
+        <w:t xml:space="preserve"> </w:t>
+      </w:r>
+      <w:r>
+        <w:t xml:space="preserve">ESTATE</w:t>
+      </w:r>
+      <w:r>
+        <w:t xml:space="preserve"> </w:t>
+      </w:r>
+      <w:r>
+        <w:t xml:space="preserve">OF</w:t>
+      </w:r>
+      <w:r>
+        <w:t xml:space="preserve"> </w:t>
+      </w:r>
+      <w:r>
+        <w:t xml:space="preserve">GOOD</w:t>
+      </w:r>
+    </w:p>
+    <w:p>
+      <w:pPr>
         <w:keepNext/>
-      </w:pPr>
-      <w:r>
-        <w:t xml:space="preserve">DONALD R. LASSMAN, CHAPTER 7 TRUSTEE</w:t>
-      </w:r>
-    </w:p>
-    <w:p>
-      <w:pPr>
-        <w:pStyle w:val="Signature"/>
+        <w:keepLines/>
+        <w:spacing w:before="0" w:after="0" w:line="276" w:lineRule="exact"/>
+        <w:ind w:left="4464" w:firstLine="0"/>
+        <w:jc w:val="left"/>
+      </w:pPr>
+      <w:r>
+        <w:t xml:space="preserve">GUYS</w:t>
+      </w:r>
+      <w:r>
+        <w:t xml:space="preserve"> </w:t>
+      </w:r>
+      <w:r>
+        <w:t xml:space="preserve">PROVISION</w:t>
+      </w:r>
+      <w:r>
+        <w:t xml:space="preserve"> </w:t>
+      </w:r>
+      <w:r>
+        <w:t xml:space="preserve">CO.</w:t>
+      </w:r>
+      <w:r>
+        <w:t xml:space="preserve"> </w:t>
+      </w:r>
+      <w:r>
+        <w:t xml:space="preserve">INC.,</w:t>
+      </w:r>
+    </w:p>
+    <w:p>
+      <w:pPr>
         <w:keepNext/>
-      </w:pPr>
-      <w:r>
-        <w:t xml:space="preserve">OF THE BANKRUPTCY ESTATE OF GOOD</w:t>
-      </w:r>
-    </w:p>
-    <w:p>
-      <w:pPr>
-        <w:pStyle w:val="Signature"/>
+        <w:keepLines/>
+        <w:spacing w:before="138" w:after="0" w:line="276" w:lineRule="exact"/>
+        <w:ind w:left="4464" w:firstLine="0"/>
+        <w:jc w:val="left"/>
+      </w:pPr>
+      <w:r>
+        <w:t xml:space="preserve">By</w:t>
+      </w:r>
+      <w:r>
+        <w:t xml:space="preserve"> </w:t>
+      </w:r>
+      <w:r>
+        <w:t xml:space="preserve">his</w:t>
+      </w:r>
+      <w:r>
+        <w:t xml:space="preserve"> </w:t>
+      </w:r>
+      <w:r>
+        <w:t xml:space="preserve">attorneys,</w:t>
+      </w:r>
+    </w:p>
+    <w:p>
+      <w:pPr>
         <w:keepNext/>
-      </w:pPr>
-      <w:r>
-        <w:t xml:space="preserve">GUYS PROVISION CO. INC.,</w:t>
-      </w:r>
-    </w:p>
-    <w:p>
-      <w:pPr>
-        <w:pStyle w:val="Single"/>
+        <w:keepLines/>
+        <w:spacing w:before="138" w:after="0" w:line="276" w:lineRule="exact"/>
+        <w:ind w:left="4464" w:firstLine="0"/>
+        <w:jc w:val="left"/>
+      </w:pPr>
+      <w:r>
+        <w:t xml:space="preserve">/​s/</w:t>
+      </w:r>
+      <w:r>
+        <w:t xml:space="preserve"> </w:t>
+      </w:r>
+      <w:r>
+        <w:t xml:space="preserve">Josephine</w:t>
+      </w:r>
+      <w:r>
+        <w:t xml:space="preserve"> </w:t>
+      </w:r>
+      <w:r>
+        <w:t xml:space="preserve">E.</w:t>
+      </w:r>
+      <w:r>
+        <w:t xml:space="preserve"> </w:t>
+      </w:r>
+      <w:r>
+        <w:t xml:space="preserve">Ban</w:t>
+      </w:r>
+    </w:p>
+    <w:p>
+      <w:pPr>
         <w:keepNext/>
-        <w:spacing w:before="0" w:after="0" w:line="180" w:lineRule="exact"/>
-      </w:pPr>
-    </w:p>
-    <w:p>
-      <w:pPr>
-        <w:pStyle w:val="Signature"/>
+        <w:keepLines/>
+        <w:spacing w:before="0" w:after="0" w:line="276" w:lineRule="exact"/>
+        <w:ind w:left="4464" w:firstLine="0"/>
+        <w:jc w:val="left"/>
+      </w:pPr>
+      <w:r>
+        <w:t xml:space="preserve">Josephine</w:t>
+      </w:r>
+      <w:r>
+        <w:t xml:space="preserve"> </w:t>
+      </w:r>
+      <w:r>
+        <w:t xml:space="preserve">E.</w:t>
+      </w:r>
+      <w:r>
+        <w:t xml:space="preserve"> </w:t>
+      </w:r>
+      <w:r>
+        <w:t xml:space="preserve">Ban,</w:t>
+      </w:r>
+      <w:r>
+        <w:t xml:space="preserve"> </w:t>
+      </w:r>
+      <w:r>
+        <w:t xml:space="preserve">Esq.</w:t>
+      </w:r>
+      <w:r>
+        <w:t xml:space="preserve"> </w:t>
+      </w:r>
+      <w:r>
+        <w:t xml:space="preserve">BBO</w:t>
+      </w:r>
+      <w:r>
+        <w:t xml:space="preserve"> </w:t>
+      </w:r>
+      <w:r>
+        <w:t xml:space="preserve">#717269</w:t>
+      </w:r>
+    </w:p>
+    <w:p>
+      <w:pPr>
         <w:keepNext/>
-      </w:pPr>
-      <w:r>
-        <w:t xml:space="preserve">By his attorneys,</w:t>
-      </w:r>
-    </w:p>
-    <w:p>
-      <w:pPr>
-        <w:pStyle w:val="Single"/>
+        <w:keepLines/>
+        <w:spacing w:before="0" w:after="0" w:line="276" w:lineRule="exact"/>
+        <w:ind w:left="4464" w:firstLine="0"/>
+        <w:jc w:val="left"/>
+      </w:pPr>
+      <w:r>
+        <w:t xml:space="preserve">Jonathan</w:t>
+      </w:r>
+      <w:r>
+        <w:t xml:space="preserve"> </w:t>
+      </w:r>
+      <w:r>
+        <w:t xml:space="preserve">M.</w:t>
+      </w:r>
+      <w:r>
+        <w:t xml:space="preserve"> </w:t>
+      </w:r>
+      <w:r>
+        <w:t xml:space="preserve">Horne,</w:t>
+      </w:r>
+      <w:r>
+        <w:t xml:space="preserve"> </w:t>
+      </w:r>
+      <w:r>
+        <w:t xml:space="preserve">Esq.</w:t>
+      </w:r>
+      <w:r>
+        <w:t xml:space="preserve"> </w:t>
+      </w:r>
+      <w:r>
+        <w:t xml:space="preserve">BBO</w:t>
+      </w:r>
+      <w:r>
+        <w:t xml:space="preserve"> </w:t>
+      </w:r>
+      <w:r>
+        <w:t xml:space="preserve">#673098</w:t>
+      </w:r>
+    </w:p>
+    <w:p>
+      <w:pPr>
         <w:keepNext/>
-        <w:spacing w:before="0" w:after="0" w:line="180" w:lineRule="exact"/>
-      </w:pPr>
-    </w:p>
-    <w:p>
-      <w:pPr>
-        <w:pStyle w:val="Signature"/>
+        <w:keepLines/>
+        <w:spacing w:before="0" w:after="0" w:line="276" w:lineRule="exact"/>
+        <w:ind w:left="4464" w:firstLine="0"/>
+        <w:jc w:val="left"/>
+      </w:pPr>
+      <w:r>
+        <w:t xml:space="preserve">Harris</w:t>
+      </w:r>
+      <w:r>
+        <w:t xml:space="preserve"> </w:t>
+      </w:r>
+      <w:r>
+        <w:t xml:space="preserve">Beach</w:t>
+      </w:r>
+      <w:r>
+        <w:t xml:space="preserve"> </w:t>
+      </w:r>
+      <w:r>
+        <w:t xml:space="preserve">Murtha</w:t>
+      </w:r>
+      <w:r>
+        <w:t xml:space="preserve"> </w:t>
+      </w:r>
+      <w:r>
+        <w:t xml:space="preserve">Cullina</w:t>
+      </w:r>
+      <w:r>
+        <w:t xml:space="preserve"> </w:t>
+      </w:r>
+      <w:r>
+        <w:t xml:space="preserve">PLLC</w:t>
+      </w:r>
+    </w:p>
+    <w:p>
+      <w:pPr>
         <w:keepNext/>
-      </w:pPr>
-      <w:r>
-        <w:t xml:space="preserve">/s/ Josephine E. Ban</w:t>
-      </w:r>
-    </w:p>
-    <w:p>
-      <w:pPr>
-        <w:pStyle w:val="Signature"/>
+        <w:keepLines/>
+        <w:spacing w:before="0" w:after="0" w:line="276" w:lineRule="exact"/>
+        <w:ind w:left="4464" w:firstLine="0"/>
+        <w:jc w:val="left"/>
+      </w:pPr>
+      <w:r>
+        <w:t xml:space="preserve">33</w:t>
+      </w:r>
+      <w:r>
+        <w:t xml:space="preserve"> </w:t>
+      </w:r>
+      <w:r>
+        <w:t xml:space="preserve">Arch</w:t>
+      </w:r>
+      <w:r>
+        <w:t xml:space="preserve"> </w:t>
+      </w:r>
+      <w:r>
+        <w:t xml:space="preserve">Street,</w:t>
+      </w:r>
+      <w:r>
+        <w:t xml:space="preserve"> </w:t>
+      </w:r>
+      <w:r>
+        <w:t xml:space="preserve">12th</w:t>
+      </w:r>
+      <w:r>
+        <w:t xml:space="preserve"> </w:t>
+      </w:r>
+      <w:r>
+        <w:t xml:space="preserve">Floor</w:t>
+      </w:r>
+    </w:p>
+    <w:p>
+      <w:pPr>
         <w:keepNext/>
-      </w:pPr>
-      <w:r>
-        <w:t xml:space="preserve">Josephine E. Ban, Esq. BBO #717269</w:t>
-      </w:r>
-    </w:p>
-    <w:p>
-      <w:pPr>
-        <w:pStyle w:val="Signature"/>
+        <w:keepLines/>
+        <w:spacing w:before="0" w:after="0" w:line="276" w:lineRule="exact"/>
+        <w:ind w:left="4464" w:firstLine="0"/>
+        <w:jc w:val="left"/>
+      </w:pPr>
+      <w:r>
+        <w:t xml:space="preserve">Boston,</w:t>
+      </w:r>
+      <w:r>
+        <w:t xml:space="preserve"> </w:t>
+      </w:r>
+      <w:r>
+        <w:t xml:space="preserve">MA</w:t>
+      </w:r>
+      <w:r>
+        <w:t xml:space="preserve"> </w:t>
+      </w:r>
+      <w:r>
+        <w:t xml:space="preserve">02110</w:t>
+      </w:r>
+    </w:p>
+    <w:p>
+      <w:pPr>
         <w:keepNext/>
-      </w:pPr>
-      <w:r>
-        <w:t xml:space="preserve">Jonathan M. Horne, Esq. BBO #673098</w:t>
-      </w:r>
-    </w:p>
-    <w:p>
-      <w:pPr>
-        <w:pStyle w:val="Signature"/>
+        <w:keepLines/>
+        <w:spacing w:before="0" w:after="0" w:line="276" w:lineRule="exact"/>
+        <w:ind w:left="4464" w:firstLine="0"/>
+        <w:jc w:val="left"/>
+      </w:pPr>
+      <w:r>
+        <w:t xml:space="preserve">617</w:t>
+        <w:noBreakHyphen/>
+        <w:t xml:space="preserve">457</w:t>
+        <w:noBreakHyphen/>
+        <w:t xml:space="preserve">4000</w:t>
+      </w:r>
+      <w:r>
+        <w:t xml:space="preserve"> </w:t>
+      </w:r>
+      <w:r>
+        <w:t xml:space="preserve">Telephone</w:t>
+      </w:r>
+    </w:p>
+    <w:p>
+      <w:pPr>
         <w:keepNext/>
-      </w:pPr>
-      <w:r>
-        <w:t xml:space="preserve">Harris Beach Murtha Cullina PLLC</w:t>
-      </w:r>
-    </w:p>
-    <w:p>
-      <w:pPr>
-        <w:pStyle w:val="Signature"/>
+        <w:keepLines/>
+        <w:spacing w:before="0" w:after="0" w:line="276" w:lineRule="exact"/>
+        <w:ind w:left="4464" w:firstLine="0"/>
+        <w:jc w:val="left"/>
+      </w:pPr>
+      <w:r>
+        <w:t xml:space="preserve">617</w:t>
+        <w:noBreakHyphen/>
+        <w:t xml:space="preserve">482</w:t>
+        <w:noBreakHyphen/>
+        <w:t xml:space="preserve">3868</w:t>
+      </w:r>
+      <w:r>
+        <w:t xml:space="preserve"> </w:t>
+      </w:r>
+      <w:r>
+        <w:t xml:space="preserve">Facsimile</w:t>
+      </w:r>
+    </w:p>
+    <w:p>
+      <w:pPr>
         <w:keepNext/>
-      </w:pPr>
-      <w:r>
-        <w:t xml:space="preserve">33 Arch Street, 12th Floor</w:t>
-      </w:r>
-    </w:p>
-    <w:p>
-      <w:pPr>
-        <w:pStyle w:val="Signature"/>
+        <w:keepLines/>
+        <w:spacing w:before="0" w:after="0" w:line="276" w:lineRule="exact"/>
+        <w:ind w:left="4464" w:firstLine="0"/>
+        <w:jc w:val="left"/>
+      </w:pPr>
+      <w:r>
+        <w:t xml:space="preserve">jban@harrisbeachmurtha.com</w:t>
+      </w:r>
+    </w:p>
+    <w:p>
+      <w:pPr>
         <w:keepNext/>
-      </w:pPr>
-      <w:r>
-        <w:t xml:space="preserve">Boston, MA 02110</w:t>
-      </w:r>
-    </w:p>
-    <w:p>
-      <w:pPr>
-        <w:pStyle w:val="Signature"/>
-        <w:keepNext/>
-      </w:pPr>
-      <w:r>
-        <w:t xml:space="preserve">617-457-4000 Telephone</w:t>
-      </w:r>
-    </w:p>
-    <w:p>
-      <w:pPr>
-        <w:pStyle w:val="Signature"/>
-        <w:keepNext/>
-      </w:pPr>
-      <w:r>
-        <w:t xml:space="preserve">617-482-3868 Facsimile</w:t>
-      </w:r>
-    </w:p>
-    <w:p>
-      <w:pPr>
-        <w:pStyle w:val="Signature"/>
-        <w:keepNext/>
-      </w:pPr>
-      <w:r>
-        <w:t xml:space="preserve">jban@harrisbeachmurtha.com</w:t>
-      </w:r>
-    </w:p>
-    <w:p>
-      <w:pPr>
-        <w:pStyle w:val="Signature"/>
-        <w:keepNext/>
+        <w:keepLines/>
+        <w:spacing w:before="0" w:after="0" w:line="276" w:lineRule="exact"/>
+        <w:ind w:left="4464" w:firstLine="0"/>
+        <w:jc w:val="left"/>
       </w:pPr>
       <w:r>
         <w:t xml:space="preserve">jhorne@harrisbeachmurtha.com</w:t>
@@ -1162,26 +2304,37 @@
     </w:p>
     <w:p>
       <w:pPr>
-        <w:pStyle w:val="Single"/>
-        <w:keepNext/>
-        <w:spacing w:before="0" w:after="0" w:line="240" w:lineRule="exact"/>
-      </w:pPr>
-    </w:p>
-    <w:p>
-      <w:pPr>
-        <w:pStyle w:val="Single"/>
-      </w:pPr>
-      <w:r>
-        <w:t xml:space="preserve">Date: August 20, 2026</w:t>
-      </w:r>
-    </w:p>
-    <w:bookmarkEnd w:id="23"/>
-    <w:bookmarkEnd w:id="24"/>
+        <w:spacing w:before="276" w:after="0" w:line="276" w:lineRule="exact"/>
+        <w:ind w:left="0" w:firstLine="0"/>
+        <w:jc w:val="left"/>
+      </w:pPr>
+      <w:r>
+        <w:t xml:space="preserve">Date: </w:t>
+      </w:r>
+      <w:r>
+        <w:t xml:space="preserve">August</w:t>
+      </w:r>
+      <w:r>
+        <w:t xml:space="preserve"> </w:t>
+      </w:r>
+      <w:r>
+        <w:t xml:space="preserve">20,</w:t>
+      </w:r>
+      <w:r>
+        <w:t xml:space="preserve"> </w:t>
+      </w:r>
+      <w:r>
+        <w:t xml:space="preserve">2026</w:t>
+      </w:r>
+    </w:p>
     <w:sectPr>
-      <w:footerReference w:type="default" r:id="rIdMabFtr1"/>
-      <w:footerReference w:type="first" r:id="rIdMabFtr2"/>
+      <w:footerReference w:type="default" r:id="rIdMabPage"/>
+      <w:footerReference w:type="first" r:id="rIdMabFirst"/>
+      <w:footnotePr>
+        <w:numRestart w:val="continuous"/>
+      </w:footnotePr>
       <w:pgSz w:w="12240" w:h="15840"/>
-      <w:pgMar w:top="1440" w:right="1440" w:bottom="1440" w:left="1440" w:header="720" w:footer="720" w:gutter="0"/>
+      <w:pgMar w:top="1440" w:right="1440" w:bottom="1440" w:left="1440" w:header="720" w:footer="732" w:gutter="0"/>
       <w:titlePg/>
     </w:sectPr>
   </w:body>
@@ -1196,7 +2349,33 @@
 <w:ftr xmlns:w="http://schemas.openxmlformats.org/wordprocessingml/2006/main" xmlns:r="http://schemas.openxmlformats.org/officeDocument/2006/relationships">
   <w:p>
     <w:pPr>
-      <w:pStyle w:val="Footer"/>
+      <w:jc w:val="center"/>
+    </w:pPr>
+    <w:r>
+      <w:fldChar w:fldCharType="begin"/>
+    </w:r>
+    <w:r>
+      <w:instrText xml:space="preserve"> PAGE </w:instrText>
+    </w:r>
+    <w:r>
+      <w:fldChar w:fldCharType="separate"/>
+    </w:r>
+    <w:r>
+      <w:t>1</w:t>
+    </w:r>
+    <w:r>
+      <w:fldChar w:fldCharType="end"/>
+    </w:r>
+  </w:p>
+</w:ftr>
+</file>
+
+<file path=word/footer2.xml><?xml version="1.0" encoding="utf-8"?>
+<w:ftr xmlns:w="http://schemas.openxmlformats.org/wordprocessingml/2006/main" xmlns:r="http://schemas.openxmlformats.org/officeDocument/2006/relationships">
+  <w:p>
+    <w:pPr>
+      <w:spacing w:before="0" w:after="0" w:line="276" w:lineRule="exact"/>
+      <w:jc w:val="center"/>
     </w:pPr>
     <w:r>
       <w:fldChar w:fldCharType="begin"/>
@@ -1217,11 +2396,11 @@
 </w:ftr>
 </file>
 
-<file path=word/footer2.xml><?xml version="1.0" encoding="utf-8"?>
+<file path=word/footer3.xml><?xml version="1.0" encoding="utf-8"?>
 <w:ftr xmlns:w="http://schemas.openxmlformats.org/wordprocessingml/2006/main" xmlns:r="http://schemas.openxmlformats.org/officeDocument/2006/relationships">
   <w:p>
     <w:pPr>
-      <w:pStyle w:val="Footer"/>
+      <w:spacing w:before="0" w:after="0" w:line="276" w:lineRule="exact"/>
     </w:pPr>
   </w:p>
 </w:ftr>
@@ -1324,142 +2503,8 @@
       </w:pPr>
     </w:lvl>
   </w:abstractNum>
-  <w:abstractNum w:abstractNumId="99411">
-    <w:nsid w:val="00A99411"/>
-    <w:multiLevelType w:val="multilevel"/>
-    <w:lvl w:ilvl="0">
-      <w:start w:val="1"/>
-      <w:numFmt w:val="decimal"/>
-      <w:lvlText w:val="%1."/>
-      <w:lvlJc w:val="left"/>
-      <w:pPr>
-        <w:ind w:left="720" w:hanging="360"/>
-      </w:pPr>
-    </w:lvl>
-    <w:lvl w:ilvl="1">
-      <w:start w:val="1"/>
-      <w:numFmt w:val="decimal"/>
-      <w:lvlText w:val="%2."/>
-      <w:lvlJc w:val="left"/>
-      <w:pPr>
-        <w:ind w:left="1440" w:hanging="360"/>
-      </w:pPr>
-    </w:lvl>
-    <w:lvl w:ilvl="2">
-      <w:start w:val="1"/>
-      <w:numFmt w:val="decimal"/>
-      <w:lvlText w:val="%3."/>
-      <w:lvlJc w:val="left"/>
-      <w:pPr>
-        <w:ind w:left="2160" w:hanging="360"/>
-      </w:pPr>
-    </w:lvl>
-    <w:lvl w:ilvl="3">
-      <w:start w:val="1"/>
-      <w:numFmt w:val="decimal"/>
-      <w:lvlText w:val="%4."/>
-      <w:lvlJc w:val="left"/>
-      <w:pPr>
-        <w:ind w:left="2880" w:hanging="360"/>
-      </w:pPr>
-    </w:lvl>
-    <w:lvl w:ilvl="4">
-      <w:start w:val="1"/>
-      <w:numFmt w:val="decimal"/>
-      <w:lvlText w:val="%5."/>
-      <w:lvlJc w:val="left"/>
-      <w:pPr>
-        <w:ind w:left="3600" w:hanging="360"/>
-      </w:pPr>
-    </w:lvl>
-    <w:lvl w:ilvl="5">
-      <w:start w:val="1"/>
-      <w:numFmt w:val="decimal"/>
-      <w:lvlText w:val="%6."/>
-      <w:lvlJc w:val="left"/>
-      <w:pPr>
-        <w:ind w:left="4320" w:hanging="360"/>
-      </w:pPr>
-    </w:lvl>
-    <w:lvl w:ilvl="6">
-      <w:start w:val="1"/>
-      <w:numFmt w:val="decimal"/>
-      <w:lvlText w:val="%7."/>
-      <w:lvlJc w:val="left"/>
-      <w:pPr>
-        <w:ind w:left="5040" w:hanging="360"/>
-      </w:pPr>
-    </w:lvl>
-    <w:lvl w:ilvl="7">
-      <w:start w:val="1"/>
-      <w:numFmt w:val="decimal"/>
-      <w:lvlText w:val="%8."/>
-      <w:lvlJc w:val="left"/>
-      <w:pPr>
-        <w:ind w:left="5760" w:hanging="360"/>
-      </w:pPr>
-    </w:lvl>
-    <w:lvl w:ilvl="8">
-      <w:start w:val="1"/>
-      <w:numFmt w:val="decimal"/>
-      <w:lvlText w:val="%9."/>
-      <w:lvlJc w:val="left"/>
-      <w:pPr>
-        <w:ind w:left="6480" w:hanging="360"/>
-      </w:pPr>
-    </w:lvl>
-  </w:abstractNum>
-  <w:abstractNum w:abstractNumId="9001">
-    <w:multiLevelType w:val="singleLevel"/>
-    <w:lvl w:ilvl="0">
-      <w:start w:val="1"/>
-      <w:numFmt w:val="decimal"/>
-      <w:pStyle w:val="NumberedParagraph"/>
-      <w:lvlText w:val="%1."/>
-      <w:lvlJc w:val="left"/>
-      <w:pPr>
-        <w:tabs>
-          <w:tab w:val="num" w:pos="1440"/>
-        </w:tabs>
-        <w:ind w:left="0" w:firstLine="720"/>
-      </w:pPr>
-    </w:lvl>
-  </w:abstractNum>
   <w:num w:numId="1000">
     <w:abstractNumId w:val="990"/>
-  </w:num>
-  <w:num w:numId="1001">
-    <w:abstractNumId w:val="99411"/>
-    <w:lvlOverride w:ilvl="0">
-      <w:startOverride w:val="1"/>
-    </w:lvlOverride>
-    <w:lvlOverride w:ilvl="1">
-      <w:startOverride w:val="1"/>
-    </w:lvlOverride>
-    <w:lvlOverride w:ilvl="2">
-      <w:startOverride w:val="1"/>
-    </w:lvlOverride>
-    <w:lvlOverride w:ilvl="3">
-      <w:startOverride w:val="1"/>
-    </w:lvlOverride>
-    <w:lvlOverride w:ilvl="4">
-      <w:startOverride w:val="1"/>
-    </w:lvlOverride>
-    <w:lvlOverride w:ilvl="5">
-      <w:startOverride w:val="1"/>
-    </w:lvlOverride>
-    <w:lvlOverride w:ilvl="6">
-      <w:startOverride w:val="1"/>
-    </w:lvlOverride>
-    <w:lvlOverride w:ilvl="7">
-      <w:startOverride w:val="1"/>
-    </w:lvlOverride>
-    <w:lvlOverride w:ilvl="8">
-      <w:startOverride w:val="1"/>
-    </w:lvlOverride>
-  </w:num>
-  <w:num w:numId="9001">
-    <w:abstractNumId w:val="9001"/>
   </w:num>
 </w:numbering>
 </file>
@@ -1469,24 +2514,49 @@
   <w:docDefaults>
     <w:rPrDefault>
       <w:rPr>
-        <w:rFonts w:ascii="EB Garamond" w:cs="EB Garamond" w:eastAsia="EB Garamond" w:hAnsi="EB Garamond"/>
+        <w:rFonts w:ascii="Times New Roman" w:hAnsi="Times New Roman" w:eastAsia="Times New Roman" w:cs="Times New Roman"/>
         <w:sz w:val="24"/>
         <w:szCs w:val="24"/>
-        <w:lang w:bidi="ar-SA" w:eastAsia="en-US" w:val="en-US"/>
+        <w:lang w:val="en-US" w:eastAsia="zh-CN" w:bidi="ar-SA"/>
       </w:rPr>
     </w:rPrDefault>
     <w:pPrDefault>
       <w:pPr>
-        <w:spacing w:after="200"/>
+        <w:widowControl/>
+        <w:spacing w:after="0"/>
       </w:pPr>
     </w:pPrDefault>
   </w:docDefaults>
-  <w:latentStyles w:count="276" w:defLockedState="0" w:defQFormat="0" w:defSemiHidden="0" w:defUIPriority="0" w:defUnhideWhenUsed="0"/>
-  <w:style w:default="1" w:styleId="Normal" w:type="paragraph">
+  <w:latentStyles w:defLockedState="0" w:defUIPriority="0" w:defSemiHidden="0" w:defUnhideWhenUsed="0" w:defQFormat="0" w:count="276"/>
+  <w:style w:type="paragraph" w:default="1" w:styleId="Normal">
     <w:name w:val="Normal"/>
     <w:qFormat/>
   </w:style>
-  <w:style w:styleId="Title" w:type="paragraph">
+  <w:style w:type="paragraph" w:styleId="BodyText">
+    <w:name w:val="Body Text"/>
+    <w:basedOn w:val="Normal"/>
+    <w:link w:val="BodyTextChar"/>
+    <w:qFormat/>
+    <w:pPr>
+      <w:spacing w:before="0" w:after="0" w:line="480" w:lineRule="exact"/>
+      <w:ind w:firstLine="720"/>
+    </w:pPr>
+  </w:style>
+  <w:style w:type="paragraph" w:customStyle="1" w:styleId="FirstParagraph">
+    <w:name w:val="First Paragraph"/>
+    <w:basedOn w:val="BodyText"/>
+    <w:next w:val="BodyText"/>
+    <w:qFormat/>
+  </w:style>
+  <w:style w:type="paragraph" w:customStyle="1" w:styleId="Compact">
+    <w:name w:val="Compact"/>
+    <w:basedOn w:val="BodyText"/>
+    <w:qFormat/>
+    <w:pPr>
+      <w:spacing w:before="36" w:after="36"/>
+    </w:pPr>
+  </w:style>
+  <w:style w:type="paragraph" w:styleId="Title">
     <w:name w:val="Title"/>
     <w:basedOn w:val="Normal"/>
     <w:next w:val="BodyText"/>
@@ -1500,24 +2570,24 @@
       <w:jc w:val="center"/>
     </w:pPr>
     <w:rPr>
-      <w:rFonts w:ascii="EB Garamond" w:cs="EB Garamond" w:eastAsia="EB Garamond" w:hAnsi="EB Garamond"/>
+      <w:rFonts w:asciiTheme="majorHAnsi" w:eastAsiaTheme="majorEastAsia" w:hAnsiTheme="majorHAnsi" w:cstheme="majorBidi"/>
       <w:sz w:val="56"/>
       <w:szCs w:val="56"/>
     </w:rPr>
   </w:style>
-  <w:style w:customStyle="1" w:styleId="TitleChar" w:type="character">
+  <w:style w:type="character" w:customStyle="1" w:styleId="TitleChar">
     <w:name w:val="Title Char"/>
     <w:basedOn w:val="DefaultParagraphFont"/>
     <w:link w:val="Title"/>
     <w:uiPriority w:val="10"/>
     <w:rsid w:val="00A10FD9"/>
     <w:rPr>
-      <w:rFonts w:ascii="EB Garamond" w:cs="EB Garamond" w:eastAsia="EB Garamond" w:hAnsi="EB Garamond"/>
+      <w:rFonts w:asciiTheme="majorHAnsi" w:eastAsiaTheme="majorEastAsia" w:hAnsiTheme="majorHAnsi" w:cstheme="majorBidi"/>
       <w:sz w:val="56"/>
       <w:szCs w:val="56"/>
     </w:rPr>
   </w:style>
-  <w:style w:styleId="Subtitle" w:type="paragraph">
+  <w:style w:type="paragraph" w:styleId="Subtitle">
     <w:name w:val="Subtitle"/>
     <w:basedOn w:val="Title"/>
     <w:next w:val="BodyText"/>
@@ -1531,27 +2601,27 @@
       </w:numPr>
     </w:pPr>
     <w:rPr>
-      <w:rFonts w:cstheme="majorBidi" w:eastAsiaTheme="majorEastAsia"/>
+      <w:rFonts w:eastAsiaTheme="majorEastAsia" w:cstheme="majorBidi"/>
       <w:spacing w:val="15"/>
       <w:sz w:val="28"/>
       <w:szCs w:val="28"/>
     </w:rPr>
   </w:style>
-  <w:style w:customStyle="1" w:styleId="SubtitleChar" w:type="character">
+  <w:style w:type="character" w:customStyle="1" w:styleId="SubtitleChar">
     <w:name w:val="Subtitle Char"/>
     <w:basedOn w:val="DefaultParagraphFont"/>
     <w:link w:val="Subtitle"/>
     <w:uiPriority w:val="11"/>
     <w:rsid w:val="00A10FD9"/>
     <w:rPr>
-      <w:rFonts w:cstheme="majorBidi" w:eastAsiaTheme="majorEastAsia"/>
-      <w:color w:themeColor="text1" w:themeTint="A6" w:val="595959"/>
+      <w:rFonts w:eastAsiaTheme="majorEastAsia" w:cstheme="majorBidi"/>
+      <w:color w:val="595959" w:themeColor="text1" w:themeTint="A6"/>
       <w:spacing w:val="15"/>
       <w:sz w:val="28"/>
       <w:szCs w:val="28"/>
     </w:rPr>
   </w:style>
-  <w:style w:customStyle="1" w:styleId="Author" w:type="paragraph">
+  <w:style w:type="paragraph" w:customStyle="1" w:styleId="Author">
     <w:name w:val="Author"/>
     <w:basedOn w:val="Title"/>
     <w:next w:val="BodyText"/>
@@ -1565,7 +2635,7 @@
       <w:szCs w:val="24"/>
     </w:rPr>
   </w:style>
-  <w:style w:styleId="Date" w:type="paragraph">
+  <w:style w:type="paragraph" w:styleId="Date">
     <w:name w:val="Date"/>
     <w:basedOn w:val="Title"/>
     <w:next w:val="BodyText"/>
@@ -1579,7 +2649,7 @@
       <w:szCs w:val="24"/>
     </w:rPr>
   </w:style>
-  <w:style w:customStyle="1" w:styleId="AbstractTitle" w:type="paragraph">
+  <w:style w:type="paragraph" w:customStyle="1" w:styleId="AbstractTitle">
     <w:name w:val="Abstract Title"/>
     <w:basedOn w:val="Normal"/>
     <w:next w:val="Abstract"/>
@@ -1587,7 +2657,7 @@
     <w:pPr>
       <w:keepNext/>
       <w:keepLines/>
-      <w:spacing w:after="0" w:before="300"/>
+      <w:spacing w:before="300" w:after="0"/>
       <w:jc w:val="center"/>
     </w:pPr>
     <w:rPr>
@@ -1596,7 +2666,7 @@
       <w:szCs w:val="20"/>
     </w:rPr>
   </w:style>
-  <w:style w:customStyle="1" w:styleId="Abstract" w:type="paragraph">
+  <w:style w:type="paragraph" w:customStyle="1" w:styleId="Abstract">
     <w:name w:val="Abstract"/>
     <w:basedOn w:val="Normal"/>
     <w:next w:val="BodyText"/>
@@ -1604,14 +2674,14 @@
     <w:pPr>
       <w:keepNext/>
       <w:keepLines/>
-      <w:spacing w:after="300" w:before="100"/>
+      <w:spacing w:before="100" w:after="300"/>
     </w:pPr>
     <w:rPr>
       <w:sz w:val="20"/>
       <w:szCs w:val="20"/>
     </w:rPr>
   </w:style>
-  <w:style w:styleId="Bibliography" w:type="paragraph">
+  <w:style w:type="paragraph" w:styleId="Bibliography">
     <w:name w:val="Bibliography"/>
     <w:basedOn w:val="Normal"/>
     <w:next w:val="Bibliography"/>
@@ -1619,7 +2689,85 @@
     <w:pPr/>
     <w:rPr/>
   </w:style>
-  <w:style w:styleId="Heading4" w:type="paragraph">
+  <w:style w:type="paragraph" w:styleId="Heading1">
+    <w:name w:val="heading 1"/>
+    <w:basedOn w:val="Normal"/>
+    <w:next w:val="BodyText"/>
+    <w:link w:val="Heading1Char"/>
+    <w:uiPriority w:val="9"/>
+    <w:qFormat/>
+    <w:rsid w:val="00A10FD9"/>
+    <w:pPr>
+      <w:keepNext/>
+      <w:keepLines/>
+      <w:spacing w:before="0" w:after="0" w:line="480" w:lineRule="exact"/>
+      <w:ind w:firstLine="0"/>
+      <w:jc w:val="center"/>
+      <w:outlineLvl w:val="0"/>
+    </w:pPr>
+    <w:rPr>
+      <w:rFonts w:ascii="Times New Roman" w:hAnsi="Times New Roman" w:eastAsia="Times New Roman" w:cs="Times New Roman"/>
+      <w:b/>
+      <w:bCs/>
+      <w:caps/>
+      <w:color w:val="000000"/>
+      <w:sz w:val="24"/>
+      <w:szCs w:val="24"/>
+    </w:rPr>
+  </w:style>
+  <w:style w:type="paragraph" w:styleId="Heading2">
+    <w:name w:val="heading 2"/>
+    <w:basedOn w:val="Normal"/>
+    <w:next w:val="BodyText"/>
+    <w:link w:val="Heading2Char"/>
+    <w:uiPriority w:val="9"/>
+    <w:semiHidden/>
+    <w:unhideWhenUsed/>
+    <w:qFormat/>
+    <w:rsid w:val="00A10FD9"/>
+    <w:pPr>
+      <w:keepNext/>
+      <w:keepLines/>
+      <w:spacing w:before="0" w:after="0" w:line="480" w:lineRule="exact"/>
+      <w:ind w:firstLine="0"/>
+      <w:outlineLvl w:val="1"/>
+    </w:pPr>
+    <w:rPr>
+      <w:rFonts w:ascii="Times New Roman" w:hAnsi="Times New Roman" w:eastAsia="Times New Roman" w:cs="Times New Roman"/>
+      <w:b/>
+      <w:bCs/>
+      <w:color w:val="000000"/>
+      <w:sz w:val="24"/>
+      <w:szCs w:val="24"/>
+    </w:rPr>
+  </w:style>
+  <w:style w:type="paragraph" w:styleId="Heading3">
+    <w:name w:val="heading 3"/>
+    <w:basedOn w:val="Normal"/>
+    <w:next w:val="BodyText"/>
+    <w:link w:val="Heading3Char"/>
+    <w:uiPriority w:val="9"/>
+    <w:semiHidden/>
+    <w:unhideWhenUsed/>
+    <w:qFormat/>
+    <w:rsid w:val="00A10FD9"/>
+    <w:pPr>
+      <w:keepNext/>
+      <w:keepLines/>
+      <w:spacing w:before="0" w:after="0" w:line="480" w:lineRule="exact"/>
+      <w:ind w:firstLine="0"/>
+      <w:outlineLvl w:val="2"/>
+    </w:pPr>
+    <w:rPr>
+      <w:rFonts w:ascii="Times New Roman" w:hAnsi="Times New Roman" w:eastAsia="Times New Roman" w:cs="Times New Roman"/>
+      <w:b/>
+      <w:bCs/>
+      <w:color w:val="000000"/>
+      <w:sz w:val="24"/>
+      <w:szCs w:val="24"/>
+    </w:rPr>
+  </w:style>
+  <w:style w:type="paragraph" w:styleId="Heading4">
     <w:name w:val="heading 4"/>
     <w:basedOn w:val="Normal"/>
     <w:next w:val="BodyText"/>
@@ -1632,17 +2780,21 @@
     <w:pPr>
       <w:keepNext/>
       <w:keepLines/>
-      <w:spacing w:after="40" w:before="80"/>
+      <w:spacing w:before="0" w:after="0" w:line="480" w:lineRule="exact"/>
+      <w:ind w:firstLine="0"/>
       <w:outlineLvl w:val="3"/>
     </w:pPr>
     <w:rPr>
-      <w:rFonts w:cstheme="majorBidi" w:eastAsiaTheme="majorEastAsia"/>
+      <w:rFonts w:ascii="Times New Roman" w:hAnsi="Times New Roman" w:eastAsia="Times New Roman" w:cs="Times New Roman"/>
+      <w:b/>
+      <w:bCs/>
       <w:i/>
-      <w:iCs/>
-      <w:color w:themeColor="accent1" w:themeShade="BF" w:val="0F4761"/>
-    </w:rPr>
-  </w:style>
-  <w:style w:styleId="Heading5" w:type="paragraph">
+      <w:color w:val="000000"/>
+      <w:sz w:val="24"/>
+      <w:szCs w:val="24"/>
+    </w:rPr>
+  </w:style>
+  <w:style w:type="paragraph" w:styleId="Heading5">
     <w:name w:val="heading 5"/>
     <w:basedOn w:val="Normal"/>
     <w:next w:val="BodyText"/>
@@ -1655,15 +2807,21 @@
     <w:pPr>
       <w:keepNext/>
       <w:keepLines/>
-      <w:spacing w:after="40" w:before="80"/>
+      <w:spacing w:before="0" w:after="0" w:line="480" w:lineRule="exact"/>
+      <w:ind w:firstLine="0"/>
       <w:outlineLvl w:val="4"/>
     </w:pPr>
     <w:rPr>
-      <w:rFonts w:cstheme="majorBidi" w:eastAsiaTheme="majorEastAsia"/>
-      <w:color w:themeColor="accent1" w:themeShade="BF" w:val="0F4761"/>
-    </w:rPr>
-  </w:style>
-  <w:style w:styleId="Heading6" w:type="paragraph">
+      <w:rFonts w:ascii="Times New Roman" w:hAnsi="Times New Roman" w:eastAsia="Times New Roman" w:cs="Times New Roman"/>
+      <w:b/>
+      <w:bCs/>
+      <w:i/>
+      <w:color w:val="000000"/>
+      <w:sz w:val="24"/>
+      <w:szCs w:val="24"/>
+    </w:rPr>
+  </w:style>
+  <w:style w:type="paragraph" w:styleId="Heading6">
     <w:name w:val="heading 6"/>
     <w:basedOn w:val="Normal"/>
     <w:next w:val="BodyText"/>
@@ -1676,17 +2834,17 @@
     <w:pPr>
       <w:keepNext/>
       <w:keepLines/>
-      <w:spacing w:after="0" w:before="40"/>
+      <w:spacing w:before="40" w:after="0"/>
       <w:outlineLvl w:val="5"/>
     </w:pPr>
     <w:rPr>
-      <w:rFonts w:cstheme="majorBidi" w:eastAsiaTheme="majorEastAsia"/>
+      <w:rFonts w:eastAsiaTheme="majorEastAsia" w:cstheme="majorBidi"/>
       <w:i/>
       <w:iCs/>
-      <w:color w:themeColor="text1" w:themeTint="A6" w:val="595959"/>
-    </w:rPr>
-  </w:style>
-  <w:style w:styleId="Heading7" w:type="paragraph">
+      <w:color w:val="595959" w:themeColor="text1" w:themeTint="A6"/>
+    </w:rPr>
+  </w:style>
+  <w:style w:type="paragraph" w:styleId="Heading7">
     <w:name w:val="heading 7"/>
     <w:basedOn w:val="Normal"/>
     <w:next w:val="BodyText"/>
@@ -1699,15 +2857,15 @@
     <w:pPr>
       <w:keepNext/>
       <w:keepLines/>
-      <w:spacing w:after="0" w:before="40"/>
+      <w:spacing w:before="40" w:after="0"/>
       <w:outlineLvl w:val="6"/>
     </w:pPr>
     <w:rPr>
-      <w:rFonts w:cstheme="majorBidi" w:eastAsiaTheme="majorEastAsia"/>
-      <w:color w:themeColor="text1" w:themeTint="A6" w:val="595959"/>
-    </w:rPr>
-  </w:style>
-  <w:style w:styleId="Heading8" w:type="paragraph">
+      <w:rFonts w:eastAsiaTheme="majorEastAsia" w:cstheme="majorBidi"/>
+      <w:color w:val="595959" w:themeColor="text1" w:themeTint="A6"/>
+    </w:rPr>
+  </w:style>
+  <w:style w:type="paragraph" w:styleId="Heading8">
     <w:name w:val="heading 8"/>
     <w:basedOn w:val="Normal"/>
     <w:next w:val="BodyText"/>
@@ -1724,13 +2882,13 @@
       <w:outlineLvl w:val="7"/>
     </w:pPr>
     <w:rPr>
-      <w:rFonts w:cstheme="majorBidi" w:eastAsiaTheme="majorEastAsia"/>
+      <w:rFonts w:eastAsiaTheme="majorEastAsia" w:cstheme="majorBidi"/>
       <w:i/>
       <w:iCs/>
-      <w:color w:themeColor="text1" w:themeTint="D8" w:val="272727"/>
-    </w:rPr>
-  </w:style>
-  <w:style w:styleId="Heading9" w:type="paragraph">
+      <w:color w:val="272727" w:themeColor="text1" w:themeTint="D8"/>
+    </w:rPr>
+  </w:style>
+  <w:style w:type="paragraph" w:styleId="Heading9">
     <w:name w:val="heading 9"/>
     <w:basedOn w:val="Normal"/>
     <w:next w:val="BodyText"/>
@@ -1747,24 +2905,24 @@
       <w:outlineLvl w:val="8"/>
     </w:pPr>
     <w:rPr>
-      <w:rFonts w:cstheme="majorBidi" w:eastAsiaTheme="majorEastAsia"/>
-      <w:color w:themeColor="text1" w:themeTint="D8" w:val="272727"/>
-    </w:rPr>
-  </w:style>
-  <w:style w:customStyle="1" w:styleId="Heading1Char" w:type="character">
+      <w:rFonts w:eastAsiaTheme="majorEastAsia" w:cstheme="majorBidi"/>
+      <w:color w:val="272727" w:themeColor="text1" w:themeTint="D8"/>
+    </w:rPr>
+  </w:style>
+  <w:style w:type="character" w:customStyle="1" w:styleId="Heading1Char">
     <w:name w:val="Heading 1 Char"/>
     <w:basedOn w:val="DefaultParagraphFont"/>
     <w:link w:val="Heading1"/>
     <w:uiPriority w:val="9"/>
     <w:rsid w:val="00A10FD9"/>
     <w:rPr>
-      <w:rFonts w:ascii="EB Garamond" w:cs="EB Garamond" w:eastAsia="EB Garamond" w:hAnsi="EB Garamond"/>
-      <w:color w:themeColor="accent1" w:themeShade="BF" w:val="0F4761"/>
+      <w:rFonts w:asciiTheme="majorHAnsi" w:eastAsiaTheme="majorEastAsia" w:hAnsiTheme="majorHAnsi" w:cstheme="majorBidi"/>
+      <w:color w:val="0F4761" w:themeColor="accent1" w:themeShade="BF"/>
       <w:sz w:val="40"/>
       <w:szCs w:val="40"/>
     </w:rPr>
   </w:style>
-  <w:style w:customStyle="1" w:styleId="Heading2Char" w:type="character">
+  <w:style w:type="character" w:customStyle="1" w:styleId="Heading2Char">
     <w:name w:val="Heading 2 Char"/>
     <w:basedOn w:val="DefaultParagraphFont"/>
     <w:link w:val="Heading2"/>
@@ -1772,13 +2930,13 @@
     <w:semiHidden/>
     <w:rsid w:val="00A10FD9"/>
     <w:rPr>
-      <w:rFonts w:ascii="EB Garamond" w:cs="EB Garamond" w:eastAsia="EB Garamond" w:hAnsi="EB Garamond"/>
-      <w:color w:themeColor="accent1" w:themeShade="BF" w:val="0F4761"/>
+      <w:rFonts w:asciiTheme="majorHAnsi" w:eastAsiaTheme="majorEastAsia" w:hAnsiTheme="majorHAnsi" w:cstheme="majorBidi"/>
+      <w:color w:val="0F4761" w:themeColor="accent1" w:themeShade="BF"/>
       <w:sz w:val="32"/>
       <w:szCs w:val="32"/>
     </w:rPr>
   </w:style>
-  <w:style w:customStyle="1" w:styleId="Heading3Char" w:type="character">
+  <w:style w:type="character" w:customStyle="1" w:styleId="Heading3Char">
     <w:name w:val="Heading 3 Char"/>
     <w:basedOn w:val="DefaultParagraphFont"/>
     <w:link w:val="Heading3"/>
@@ -1786,13 +2944,13 @@
     <w:semiHidden/>
     <w:rsid w:val="00A10FD9"/>
     <w:rPr>
-      <w:rFonts w:cstheme="majorBidi" w:eastAsiaTheme="majorEastAsia"/>
-      <w:color w:themeColor="accent1" w:themeShade="BF" w:val="0F4761"/>
+      <w:rFonts w:eastAsiaTheme="majorEastAsia" w:cstheme="majorBidi"/>
+      <w:color w:val="0F4761" w:themeColor="accent1" w:themeShade="BF"/>
       <w:sz w:val="28"/>
       <w:szCs w:val="28"/>
     </w:rPr>
   </w:style>
-  <w:style w:customStyle="1" w:styleId="Heading4Char" w:type="character">
+  <w:style w:type="character" w:customStyle="1" w:styleId="Heading4Char">
     <w:name w:val="Heading 4 Char"/>
     <w:basedOn w:val="DefaultParagraphFont"/>
     <w:link w:val="Heading4"/>
@@ -1800,13 +2958,13 @@
     <w:semiHidden/>
     <w:rsid w:val="00A10FD9"/>
     <w:rPr>
-      <w:rFonts w:cstheme="majorBidi" w:eastAsiaTheme="majorEastAsia"/>
+      <w:rFonts w:eastAsiaTheme="majorEastAsia" w:cstheme="majorBidi"/>
       <w:i/>
       <w:iCs/>
-      <w:color w:themeColor="accent1" w:themeShade="BF" w:val="0F4761"/>
-    </w:rPr>
-  </w:style>
-  <w:style w:customStyle="1" w:styleId="Heading5Char" w:type="character">
+      <w:color w:val="0F4761" w:themeColor="accent1" w:themeShade="BF"/>
+    </w:rPr>
+  </w:style>
+  <w:style w:type="character" w:customStyle="1" w:styleId="Heading5Char">
     <w:name w:val="Heading 5 Char"/>
     <w:basedOn w:val="DefaultParagraphFont"/>
     <w:link w:val="Heading5"/>
@@ -1814,11 +2972,11 @@
     <w:semiHidden/>
     <w:rsid w:val="00A10FD9"/>
     <w:rPr>
-      <w:rFonts w:cstheme="majorBidi" w:eastAsiaTheme="majorEastAsia"/>
-      <w:color w:themeColor="accent1" w:themeShade="BF" w:val="0F4761"/>
-    </w:rPr>
-  </w:style>
-  <w:style w:customStyle="1" w:styleId="Heading6Char" w:type="character">
+      <w:rFonts w:eastAsiaTheme="majorEastAsia" w:cstheme="majorBidi"/>
+      <w:color w:val="0F4761" w:themeColor="accent1" w:themeShade="BF"/>
+    </w:rPr>
+  </w:style>
+  <w:style w:type="character" w:customStyle="1" w:styleId="Heading6Char">
     <w:name w:val="Heading 6 Char"/>
     <w:basedOn w:val="DefaultParagraphFont"/>
     <w:link w:val="Heading6"/>
@@ -1826,13 +2984,13 @@
     <w:semiHidden/>
     <w:rsid w:val="00A10FD9"/>
     <w:rPr>
-      <w:rFonts w:cstheme="majorBidi" w:eastAsiaTheme="majorEastAsia"/>
+      <w:rFonts w:eastAsiaTheme="majorEastAsia" w:cstheme="majorBidi"/>
       <w:i/>
       <w:iCs/>
-      <w:color w:themeColor="text1" w:themeTint="A6" w:val="595959"/>
-    </w:rPr>
-  </w:style>
-  <w:style w:customStyle="1" w:styleId="Heading7Char" w:type="character">
+      <w:color w:val="595959" w:themeColor="text1" w:themeTint="A6"/>
+    </w:rPr>
+  </w:style>
+  <w:style w:type="character" w:customStyle="1" w:styleId="Heading7Char">
     <w:name w:val="Heading 7 Char"/>
     <w:basedOn w:val="DefaultParagraphFont"/>
     <w:link w:val="Heading7"/>
@@ -1840,11 +2998,11 @@
     <w:semiHidden/>
     <w:rsid w:val="00A10FD9"/>
     <w:rPr>
-      <w:rFonts w:cstheme="majorBidi" w:eastAsiaTheme="majorEastAsia"/>
-      <w:color w:themeColor="text1" w:themeTint="A6" w:val="595959"/>
-    </w:rPr>
-  </w:style>
-  <w:style w:customStyle="1" w:styleId="Heading8Char" w:type="character">
+      <w:rFonts w:eastAsiaTheme="majorEastAsia" w:cstheme="majorBidi"/>
+      <w:color w:val="595959" w:themeColor="text1" w:themeTint="A6"/>
+    </w:rPr>
+  </w:style>
+  <w:style w:type="character" w:customStyle="1" w:styleId="Heading8Char">
     <w:name w:val="Heading 8 Char"/>
     <w:basedOn w:val="DefaultParagraphFont"/>
     <w:link w:val="Heading8"/>
@@ -1852,13 +3010,13 @@
     <w:semiHidden/>
     <w:rsid w:val="00A10FD9"/>
     <w:rPr>
-      <w:rFonts w:cstheme="majorBidi" w:eastAsiaTheme="majorEastAsia"/>
+      <w:rFonts w:eastAsiaTheme="majorEastAsia" w:cstheme="majorBidi"/>
       <w:i/>
       <w:iCs/>
-      <w:color w:themeColor="text1" w:themeTint="D8" w:val="272727"/>
-    </w:rPr>
-  </w:style>
-  <w:style w:customStyle="1" w:styleId="Heading9Char" w:type="character">
+      <w:color w:val="272727" w:themeColor="text1" w:themeTint="D8"/>
+    </w:rPr>
+  </w:style>
+  <w:style w:type="character" w:customStyle="1" w:styleId="Heading9Char">
     <w:name w:val="Heading 9 Char"/>
     <w:basedOn w:val="DefaultParagraphFont"/>
     <w:link w:val="Heading9"/>
@@ -1866,11 +3024,20 @@
     <w:semiHidden/>
     <w:rsid w:val="00A10FD9"/>
     <w:rPr>
-      <w:rFonts w:cstheme="majorBidi" w:eastAsiaTheme="majorEastAsia"/>
-      <w:color w:themeColor="text1" w:themeTint="D8" w:val="272727"/>
-    </w:rPr>
-  </w:style>
-  <w:style w:styleId="BlockText" w:type="paragraph">
+      <w:rFonts w:eastAsiaTheme="majorEastAsia" w:cstheme="majorBidi"/>
+      <w:color w:val="272727" w:themeColor="text1" w:themeTint="D8"/>
+    </w:rPr>
+  </w:style>
+  <w:style w:type="paragraph" w:customStyle="1" w:styleId="ListItem">
+    <w:name w:val="List Item"/>
+    <w:basedOn w:val="BodyText"/>
+    <w:qFormat/>
+    <w:pPr>
+      <w:spacing w:before="0" w:after="0" w:line="480" w:lineRule="exact"/>
+      <w:ind w:left="720" w:hanging="720"/>
+    </w:pPr>
+  </w:style>
+  <w:style w:type="paragraph" w:styleId="BlockText">
     <w:name w:val="Block Text"/>
     <w:basedOn w:val="BodyText"/>
     <w:next w:val="BodyText"/>
@@ -1878,11 +3045,27 @@
     <w:unhideWhenUsed/>
     <w:qFormat/>
     <w:pPr>
-      <w:spacing w:after="100" w:before="100"/>
-      <w:ind w:firstLine="0" w:left="480" w:right="480"/>
+      <w:spacing w:before="280" w:after="280" w:line="276" w:lineRule="exact"/>
+      <w:ind w:firstLine="0" w:left="720" w:right="720"/>
     </w:pPr>
   </w:style>
-  <w:style w:styleId="FootnoteBlockText" w:type="paragraph">
+  <w:style w:type="paragraph" w:styleId="FootnoteText">
+    <w:name w:val="Footnote Text"/>
+    <w:basedOn w:val="Normal"/>
+    <w:next w:val="FootnoteText"/>
+    <w:uiPriority w:val="9"/>
+    <w:unhideWhenUsed/>
+    <w:qFormat/>
+    <w:pPr>
+      <w:keepLines/>
+      <w:spacing w:before="0" w:after="140" w:line="230" w:lineRule="exact"/>
+    </w:pPr>
+    <w:rPr>
+      <w:sz w:val="20"/>
+      <w:szCs w:val="20"/>
+    </w:rPr>
+  </w:style>
+  <w:style w:type="paragraph" w:styleId="FootnoteBlockText">
     <w:name w:val="Footnote Block Text"/>
     <w:basedOn w:val="FootnoteText"/>
     <w:next w:val="FootnoteText"/>
@@ -1890,38 +3073,29 @@
     <w:unhideWhenUsed/>
     <w:qFormat/>
     <w:pPr>
-      <w:spacing w:after="100" w:before="100"/>
-      <w:ind w:firstLine="0" w:left="480" w:right="480"/>
+      <w:spacing w:before="280" w:after="280"/>
+      <w:ind w:firstLine="0" w:left="720" w:right="720"/>
     </w:pPr>
   </w:style>
-  <w:style w:default="1" w:styleId="DefaultParagraphFont" w:type="character">
+  <w:style w:type="character" w:default="1" w:styleId="DefaultParagraphFont">
     <w:name w:val="Default Paragraph Font"/>
     <w:semiHidden/>
     <w:unhideWhenUsed/>
   </w:style>
-  <w:style w:default="1" w:styleId="Table" w:type="table">
+  <w:style w:type="table" w:default="1" w:styleId="Table">
     <w:name w:val="Table"/>
     <w:basedOn w:val="TableNormal"/>
-    <w:semiHidden/>
-    <w:unhideWhenUsed/>
     <w:qFormat/>
     <w:tblPr>
-      <w:tblInd w:type="dxa" w:w="0"/>
+      <w:tblInd w:w="0" w:type="dxa"/>
       <w:tblCellMar>
-        <w:top w:type="dxa" w:w="0"/>
-        <w:left w:type="dxa" w:w="108"/>
-        <w:bottom w:type="dxa" w:w="0"/>
-        <w:right w:type="dxa" w:w="108"/>
+        <w:top w:w="0" w:type="dxa"/>
+        <w:left w:w="108" w:type="dxa"/>
+        <w:bottom w:w="0" w:type="dxa"/>
+        <w:right w:w="108" w:type="dxa"/>
       </w:tblCellMar>
     </w:tblPr>
     <w:tblStylePr w:type="firstRow">
-      <w:tblPr>
-        <w:jc w:val="left"/>
-        <w:tblInd w:type="dxa" w:w="0"/>
-      </w:tblPr>
-      <w:trPr>
-        <w:jc w:val="left"/>
-      </w:trPr>
       <w:tcPr>
         <w:tcBorders>
           <w:bottom w:val="single"/>
@@ -1930,7 +3104,7 @@
       </w:tcPr>
     </w:tblStylePr>
   </w:style>
-  <w:style w:customStyle="1" w:styleId="DefinitionTerm" w:type="paragraph">
+  <w:style w:type="paragraph" w:customStyle="1" w:styleId="DefinitionTerm">
     <w:name w:val="Definition Term"/>
     <w:basedOn w:val="Normal"/>
     <w:next w:val="Definition"/>
@@ -1943,49 +3117,49 @@
       <w:b/>
     </w:rPr>
   </w:style>
-  <w:style w:customStyle="1" w:styleId="Definition" w:type="paragraph">
+  <w:style w:type="paragraph" w:customStyle="1" w:styleId="Definition">
     <w:name w:val="Definition"/>
     <w:basedOn w:val="Normal"/>
   </w:style>
-  <w:style w:styleId="Caption" w:type="paragraph">
+  <w:style w:type="paragraph" w:styleId="Caption">
     <w:name w:val="Caption"/>
     <w:basedOn w:val="Normal"/>
     <w:link w:val="BodyTextChar"/>
     <w:pPr>
-      <w:spacing w:after="120" w:before="0"/>
+      <w:spacing w:before="0" w:after="120"/>
     </w:pPr>
     <w:rPr>
       <w:i/>
     </w:rPr>
   </w:style>
-  <w:style w:customStyle="1" w:styleId="TableCaption" w:type="paragraph">
+  <w:style w:type="paragraph" w:customStyle="1" w:styleId="TableCaption">
     <w:name w:val="Table Caption"/>
     <w:basedOn w:val="Caption"/>
     <w:pPr>
       <w:keepNext/>
     </w:pPr>
   </w:style>
-  <w:style w:customStyle="1" w:styleId="ImageCaption" w:type="paragraph">
+  <w:style w:type="paragraph" w:customStyle="1" w:styleId="ImageCaption">
     <w:name w:val="Image Caption"/>
     <w:basedOn w:val="Caption"/>
   </w:style>
-  <w:style w:customStyle="1" w:styleId="Figure" w:type="paragraph">
+  <w:style w:type="paragraph" w:customStyle="1" w:styleId="Figure">
     <w:name w:val="Figure"/>
     <w:basedOn w:val="Normal"/>
   </w:style>
-  <w:style w:customStyle="1" w:styleId="CaptionedFigure" w:type="paragraph">
+  <w:style w:type="paragraph" w:customStyle="1" w:styleId="CaptionedFigure">
     <w:name w:val="Captioned Figure"/>
     <w:basedOn w:val="Figure"/>
     <w:pPr>
       <w:keepNext/>
     </w:pPr>
   </w:style>
-  <w:style w:customStyle="1" w:styleId="BodyTextChar" w:type="character">
+  <w:style w:type="character" w:customStyle="1" w:styleId="BodyTextChar">
     <w:name w:val="Body Text Char"/>
     <w:basedOn w:val="DefaultParagraphFont"/>
     <w:link w:val="BodyText"/>
   </w:style>
-  <w:style w:customStyle="1" w:styleId="VerbatimChar" w:type="character">
+  <w:style w:type="character" w:customStyle="1" w:styleId="VerbatimChar">
     <w:name w:val="Verbatim Char"/>
     <w:basedOn w:val="BodyTextChar"/>
     <w:rPr>
@@ -1993,25 +3167,25 @@
       <w:sz w:val="22"/>
     </w:rPr>
   </w:style>
-  <w:style w:customStyle="1" w:styleId="SectionNumber" w:type="character">
+  <w:style w:type="character" w:customStyle="1" w:styleId="SectionNumber">
     <w:name w:val="Section Number"/>
     <w:basedOn w:val="BodyTextChar"/>
   </w:style>
-  <w:style w:styleId="FootnoteReference" w:type="character">
+  <w:style w:type="character" w:styleId="FootnoteReference">
     <w:name w:val="Footnote Reference"/>
     <w:basedOn w:val="BodyTextChar"/>
     <w:rPr>
       <w:vertAlign w:val="superscript"/>
     </w:rPr>
   </w:style>
-  <w:style w:styleId="Hyperlink" w:type="character">
+  <w:style w:type="character" w:styleId="Hyperlink">
     <w:name w:val="Hyperlink"/>
     <w:basedOn w:val="BodyTextChar"/>
     <w:rPr>
-      <w:color w:themeColor="accent1" w:val="4F81BD"/>
-    </w:rPr>
-  </w:style>
-  <w:style w:styleId="TOCHeading" w:type="paragraph">
+      <w:color w:val="000000"/>
+    </w:rPr>
+  </w:style>
+  <w:style w:type="paragraph" w:styleId="TOCHeading">
     <w:name w:val="TOC Heading"/>
     <w:basedOn w:val="Heading1"/>
     <w:next w:val="BodyText"/>
@@ -2023,168 +3197,50 @@
       <w:outlineLvl w:val="9"/>
     </w:pPr>
     <w:rPr>
-      <w:rFonts w:ascii="EB Garamond" w:cs="EB Garamond" w:eastAsia="EB Garamond" w:hAnsi="EB Garamond"/>
+      <w:rFonts w:asciiTheme="majorHAnsi" w:eastAsiaTheme="majorEastAsia" w:hAnsiTheme="majorHAnsi" w:cstheme="majorBidi"/>
       <w:b w:val="0"/>
       <w:bCs w:val="0"/>
-      <w:color w:themeColor="accent1" w:themeShade="BF" w:val="365F91"/>
-    </w:rPr>
-  </w:style>
-  <w:style w:styleId="Heading1" w:type="paragraph">
-    <w:name w:val="heading 1"/>
-    <w:basedOn w:val="Normal"/>
-    <w:next w:val="BodyText"/>
-    <w:uiPriority w:val="9"/>
-    <w:qFormat/>
-    <w:pPr>
-      <w:keepNext/>
-      <w:keepLines/>
-      <w:spacing w:after="0" w:before="0" w:line="480" w:lineRule="exact"/>
-      <w:ind w:firstLine="0"/>
-      <w:jc w:val="center"/>
-      <w:outlineLvl w:val="0"/>
-    </w:pPr>
-    <w:rPr>
-      <w:b/>
-      <w:bCs/>
-      <w:caps/>
-      <w:color w:val="000000"/>
-      <w:sz w:val="24"/>
-    </w:rPr>
-  </w:style>
-  <w:style w:styleId="Heading2" w:type="paragraph">
-    <w:name w:val="heading 2"/>
-    <w:basedOn w:val="Normal"/>
-    <w:next w:val="BodyText"/>
-    <w:uiPriority w:val="9"/>
-    <w:unhideWhenUsed/>
-    <w:qFormat/>
-    <w:pPr>
-      <w:keepNext/>
-      <w:keepLines/>
-      <w:spacing w:after="0" w:before="0" w:line="480" w:lineRule="exact"/>
-      <w:ind w:firstLine="0"/>
-      <w:jc w:val="center"/>
-      <w:outlineLvl w:val="1"/>
-    </w:pPr>
-    <w:rPr>
-      <w:b/>
-      <w:bCs/>
-      <w:color w:val="000000"/>
-      <w:sz w:val="24"/>
-    </w:rPr>
-  </w:style>
-  <w:style w:styleId="Heading3" w:type="paragraph">
-    <w:name w:val="heading 3"/>
-    <w:basedOn w:val="Normal"/>
-    <w:next w:val="BodyText"/>
-    <w:uiPriority w:val="9"/>
-    <w:unhideWhenUsed/>
-    <w:qFormat/>
-    <w:pPr>
-      <w:keepNext/>
-      <w:keepLines/>
-      <w:spacing w:after="0" w:before="0" w:line="480" w:lineRule="exact"/>
-      <w:ind w:firstLine="0"/>
-      <w:outlineLvl w:val="2"/>
-    </w:pPr>
-    <w:rPr>
-      <w:b/>
-      <w:bCs/>
-      <w:color w:val="000000"/>
-      <w:sz w:val="24"/>
-    </w:rPr>
-  </w:style>
-  <w:style w:styleId="BodyText" w:type="paragraph">
-    <w:name w:val="Body Text"/>
-    <w:basedOn w:val="Normal"/>
-    <w:qFormat/>
-    <w:pPr>
-      <w:spacing w:after="0" w:before="0" w:line="480" w:lineRule="exact"/>
-      <w:ind w:firstLine="720"/>
-    </w:pPr>
-  </w:style>
-  <w:style w:styleId="FirstParagraph" w:type="paragraph">
-    <w:name w:val="First Paragraph"/>
-    <w:basedOn w:val="BodyText"/>
-    <w:next w:val="BodyText"/>
-    <w:qFormat/>
-    <w:pPr>
-      <w:spacing w:after="0" w:before="0" w:line="480" w:lineRule="exact"/>
-      <w:ind w:firstLine="720"/>
-    </w:pPr>
-  </w:style>
-  <w:style w:styleId="Compact" w:type="paragraph">
-    <w:name w:val="Compact"/>
+      <w:color w:val="365F91" w:themeColor="accent1" w:themeShade="BF"/>
+    </w:rPr>
+  </w:style>
+  <w:style w:type="paragraph" w:customStyle="1" w:styleId="BodyTextNote">
+    <w:name w:val="Body Text Note"/>
     <w:basedOn w:val="BodyText"/>
     <w:qFormat/>
     <w:pPr>
-      <w:spacing w:after="0" w:before="0" w:line="480" w:lineRule="exact"/>
-      <w:ind w:firstLine="0"/>
+      <w:widowControl w:val="0"/>
     </w:pPr>
   </w:style>
-  <w:style w:styleId="FootnoteText" w:type="paragraph">
-    <w:name w:val="footnote text"/>
-    <w:basedOn w:val="Normal"/>
-    <w:uiPriority w:val="99"/>
-    <w:unhideWhenUsed/>
-    <w:pPr>
-      <w:spacing w:after="0" w:before="0" w:line="240" w:lineRule="auto"/>
-      <w:ind w:firstLine="0"/>
-    </w:pPr>
-    <w:rPr>
-      <w:sz w:val="20"/>
-      <w:szCs w:val="20"/>
-    </w:rPr>
-  </w:style>
-  <w:style w:styleId="Footer" w:type="paragraph">
-    <w:name w:val="footer"/>
-    <w:basedOn w:val="Normal"/>
-    <w:uiPriority w:val="99"/>
-    <w:unhideWhenUsed/>
-    <w:pPr>
-      <w:spacing w:after="0" w:before="0" w:line="240" w:lineRule="auto"/>
-      <w:ind w:firstLine="0"/>
-      <w:jc w:val="center"/>
-    </w:pPr>
-  </w:style>
-  <w:style w:customStyle="1" w:styleId="NumberedParagraph" w:type="paragraph">
+  <w:style w:type="paragraph" w:customStyle="1" w:styleId="NumberedParagraph">
     <w:name w:val="Numbered Paragraph"/>
     <w:basedOn w:val="BodyText"/>
     <w:qFormat/>
     <w:pPr>
-      <w:numPr>
-        <w:ilvl w:val="0"/>
-        <w:numId w:val="9001"/>
-      </w:numPr>
-      <w:spacing w:after="0" w:before="0" w:line="480" w:lineRule="exact"/>
-      <w:ind w:firstLine="720" w:left="0"/>
+      <w:tabs>
+        <w:tab w:val="left" w:pos="1440"/>
+      </w:tabs>
+      <w:spacing w:before="0" w:after="0" w:line="480" w:lineRule="exact"/>
+      <w:ind w:firstLine="720"/>
     </w:pPr>
   </w:style>
-  <w:style w:customStyle="1" w:styleId="Centered" w:type="paragraph">
-    <w:name w:val="Centered"/>
-    <w:basedOn w:val="Normal"/>
+  <w:style w:type="paragraph" w:customStyle="1" w:styleId="NumberedParagraphNote">
+    <w:name w:val="Numbered Paragraph Note"/>
+    <w:basedOn w:val="NumberedParagraph"/>
     <w:qFormat/>
     <w:pPr>
-      <w:spacing w:after="0" w:before="0" w:line="276" w:lineRule="exact"/>
-      <w:ind w:firstLine="0"/>
-      <w:jc w:val="center"/>
+      <w:widowControl w:val="0"/>
     </w:pPr>
   </w:style>
-  <w:style w:customStyle="1" w:styleId="Single" w:type="paragraph">
-    <w:name w:val="Single"/>
-    <w:basedOn w:val="Normal"/>
+  <w:style w:type="paragraph" w:customStyle="1" w:styleId="LetteredItem">
+    <w:name w:val="Lettered Item"/>
+    <w:basedOn w:val="BodyText"/>
     <w:qFormat/>
     <w:pPr>
-      <w:spacing w:after="0" w:before="0" w:line="276" w:lineRule="exact"/>
-      <w:ind w:firstLine="0"/>
-    </w:pPr>
-  </w:style>
-  <w:style w:customStyle="1" w:styleId="Signature" w:type="paragraph">
-    <w:name w:val="Signature"/>
-    <w:basedOn w:val="Single"/>
-    <w:qFormat/>
-    <w:pPr>
-      <w:ind w:firstLine="0" w:left="4464"/>
+      <w:tabs>
+        <w:tab w:val="left" w:pos="1440"/>
+      </w:tabs>
+      <w:spacing w:before="0" w:after="0" w:line="480" w:lineRule="exact"/>
+      <w:ind w:left="1440" w:hanging="720"/>
     </w:pPr>
   </w:style>
   <w:style w:type="paragraph" w:customStyle="1" w:styleId="SourceCode">

</xml_diff>